<commit_message>
Results finished for mutational signatures.
</commit_message>
<xml_diff>
--- a/Paper dani draft.docx
+++ b/Paper dani draft.docx
@@ -5,12 +5,15 @@
     <w:p>
       <w:pPr>
         <w:pStyle w:val="Title"/>
-        <w:rPr>
+        <w:spacing w:line="480" w:lineRule="auto"/>
+        <w:rPr>
+          <w:rFonts w:ascii="Times New Roman" w:hAnsi="Times New Roman" w:cs="Times New Roman"/>
           <w:lang w:val="en-US"/>
         </w:rPr>
       </w:pPr>
       <w:r>
         <w:rPr>
+          <w:rFonts w:ascii="Times New Roman" w:hAnsi="Times New Roman" w:cs="Times New Roman"/>
           <w:lang w:val="en-US"/>
         </w:rPr>
         <w:t xml:space="preserve">Paper </w:t>
@@ -18,6 +21,7 @@
       <w:proofErr w:type="spellStart"/>
       <w:r>
         <w:rPr>
+          <w:rFonts w:ascii="Times New Roman" w:hAnsi="Times New Roman" w:cs="Times New Roman"/>
           <w:lang w:val="en-US"/>
         </w:rPr>
         <w:t>dani</w:t>
@@ -25,6 +29,7 @@
       <w:proofErr w:type="spellEnd"/>
       <w:r>
         <w:rPr>
+          <w:rFonts w:ascii="Times New Roman" w:hAnsi="Times New Roman" w:cs="Times New Roman"/>
           <w:lang w:val="en-US"/>
         </w:rPr>
         <w:t xml:space="preserve"> draft</w:t>
@@ -33,127 +38,340 @@
     <w:p>
       <w:pPr>
         <w:pStyle w:val="Heading1"/>
+        <w:spacing w:line="480" w:lineRule="auto"/>
+        <w:rPr>
+          <w:rFonts w:ascii="Times New Roman" w:hAnsi="Times New Roman" w:cs="Times New Roman"/>
+        </w:rPr>
       </w:pPr>
       <w:r>
+        <w:rPr>
+          <w:rFonts w:ascii="Times New Roman" w:hAnsi="Times New Roman" w:cs="Times New Roman"/>
+        </w:rPr>
         <w:t>Methods</w:t>
       </w:r>
     </w:p>
     <w:p>
       <w:pPr>
         <w:pStyle w:val="Heading2"/>
+        <w:spacing w:line="480" w:lineRule="auto"/>
+        <w:rPr>
+          <w:rFonts w:ascii="Times New Roman" w:hAnsi="Times New Roman" w:cs="Times New Roman"/>
+        </w:rPr>
       </w:pPr>
       <w:bookmarkStart w:id="0" w:name="OLE_LINK1"/>
       <w:r>
+        <w:rPr>
+          <w:rFonts w:ascii="Times New Roman" w:hAnsi="Times New Roman" w:cs="Times New Roman"/>
+        </w:rPr>
         <w:t>Mutational Signatures</w:t>
       </w:r>
     </w:p>
     <w:p>
       <w:pPr>
+        <w:spacing w:line="480" w:lineRule="auto"/>
         <w:jc w:val="both"/>
+        <w:rPr>
+          <w:rFonts w:ascii="Times New Roman" w:hAnsi="Times New Roman" w:cs="Times New Roman"/>
+          <w:sz w:val="20"/>
+          <w:szCs w:val="20"/>
+          <w:lang w:val="en-US"/>
+        </w:rPr>
       </w:pPr>
       <w:r>
+        <w:rPr>
+          <w:rFonts w:ascii="Times New Roman" w:hAnsi="Times New Roman" w:cs="Times New Roman"/>
+          <w:sz w:val="20"/>
+          <w:szCs w:val="20"/>
+          <w:lang w:val="en-US"/>
+        </w:rPr>
         <w:t>The mutational signatures analysis was performed in R version 4.4.1 and an anaconda environment with python3 version 3.10 using the packages from the  SigProfiler framework.</w:t>
       </w:r>
       <w:r>
+        <w:rPr>
+          <w:rFonts w:ascii="Times New Roman" w:hAnsi="Times New Roman" w:cs="Times New Roman"/>
+          <w:sz w:val="20"/>
+          <w:szCs w:val="20"/>
+          <w:lang w:val="en-US"/>
+        </w:rPr>
         <w:t xml:space="preserve"> The cohort is compossed of 358 unique tumor samples and 60,145 variants </w:t>
       </w:r>
       <w:r>
+        <w:rPr>
+          <w:rFonts w:ascii="Times New Roman" w:hAnsi="Times New Roman" w:cs="Times New Roman"/>
+          <w:sz w:val="20"/>
+          <w:szCs w:val="20"/>
+          <w:lang w:val="en-US"/>
+        </w:rPr>
         <w:t xml:space="preserve">obtained by exome sequencing </w:t>
       </w:r>
       <w:r>
+        <w:rPr>
+          <w:rFonts w:ascii="Times New Roman" w:hAnsi="Times New Roman" w:cs="Times New Roman"/>
+          <w:sz w:val="20"/>
+          <w:szCs w:val="20"/>
+          <w:lang w:val="en-US"/>
+        </w:rPr>
         <w:t xml:space="preserve">which are contained in a MAF file, that </w:t>
       </w:r>
       <w:r>
+        <w:rPr>
+          <w:rFonts w:ascii="Times New Roman" w:hAnsi="Times New Roman" w:cs="Times New Roman"/>
+          <w:sz w:val="20"/>
+          <w:szCs w:val="20"/>
+          <w:lang w:val="en-US"/>
+        </w:rPr>
         <w:t>was adapted to be compatible with the packages from SigProfiler and filtered to contain only SNP variants</w:t>
       </w:r>
       <w:r>
+        <w:rPr>
+          <w:rFonts w:ascii="Times New Roman" w:hAnsi="Times New Roman" w:cs="Times New Roman"/>
+          <w:sz w:val="20"/>
+          <w:szCs w:val="20"/>
+          <w:lang w:val="en-US"/>
+        </w:rPr>
         <w:t xml:space="preserve">. </w:t>
       </w:r>
       <w:r>
+        <w:rPr>
+          <w:rFonts w:ascii="Times New Roman" w:hAnsi="Times New Roman" w:cs="Times New Roman"/>
+          <w:sz w:val="20"/>
+          <w:szCs w:val="20"/>
+          <w:lang w:val="en-US"/>
+        </w:rPr>
         <w:t xml:space="preserve">A mutational profile matrix and mutation classification </w:t>
       </w:r>
       <w:r>
+        <w:rPr>
+          <w:rFonts w:ascii="Times New Roman" w:hAnsi="Times New Roman" w:cs="Times New Roman"/>
+          <w:sz w:val="20"/>
+          <w:szCs w:val="20"/>
+          <w:lang w:val="en-US"/>
+        </w:rPr>
         <w:t>plots for</w:t>
       </w:r>
       <w:r>
+        <w:rPr>
+          <w:rFonts w:ascii="Times New Roman" w:hAnsi="Times New Roman" w:cs="Times New Roman"/>
+          <w:sz w:val="20"/>
+          <w:szCs w:val="20"/>
+          <w:lang w:val="en-US"/>
+        </w:rPr>
         <w:t xml:space="preserve"> SBS96 were generated using the R package SigProfilerMatrixGeneratorR version 1.3.6</w:t>
       </w:r>
       <w:r>
+        <w:rPr>
+          <w:rFonts w:ascii="Times New Roman" w:hAnsi="Times New Roman" w:cs="Times New Roman"/>
+          <w:sz w:val="20"/>
+          <w:szCs w:val="20"/>
+          <w:lang w:val="en-US"/>
+        </w:rPr>
         <w:t xml:space="preserve"> and SigProfilerPlottingR version 1.4.3</w:t>
       </w:r>
       <w:r>
+        <w:rPr>
+          <w:rFonts w:ascii="Times New Roman" w:hAnsi="Times New Roman" w:cs="Times New Roman"/>
+          <w:sz w:val="20"/>
+          <w:szCs w:val="20"/>
+          <w:lang w:val="en-US"/>
+        </w:rPr>
         <w:t xml:space="preserve">. Using the corresponding clinical </w:t>
       </w:r>
       <w:r>
-        <w:t xml:space="preserve">dataset the subgrups of our cancer cohort. </w:t>
-      </w:r>
-      <w:r>
-        <w:rPr>
-          <w:i/>
-          <w:iCs/>
-        </w:rPr>
-        <w:t>De novo</w:t>
-      </w:r>
-      <w:r>
-        <w:rPr>
-          <w:i/>
-          <w:iCs/>
+        <w:rPr>
+          <w:rFonts w:ascii="Times New Roman" w:hAnsi="Times New Roman" w:cs="Times New Roman"/>
+          <w:sz w:val="20"/>
+          <w:szCs w:val="20"/>
+          <w:lang w:val="en-US"/>
+        </w:rPr>
+        <w:t>dataset the subgrups of our cancer cohort. De novo</w:t>
+      </w:r>
+      <w:r>
+        <w:rPr>
+          <w:rFonts w:ascii="Times New Roman" w:hAnsi="Times New Roman" w:cs="Times New Roman"/>
+          <w:sz w:val="20"/>
+          <w:szCs w:val="20"/>
+          <w:lang w:val="en-US"/>
+        </w:rPr>
+        <w:t xml:space="preserve"> and mapped to COSMIC signatures were obtained with the R package SigProfilerExtractorR version 1.2.6, the maximum number of signatures was set to 5 because of high runing time for greater numbers of signatures, and a number of NMF of 100 to get stable results</w:t>
+      </w:r>
+      <w:r>
+        <w:rPr>
+          <w:rFonts w:ascii="Times New Roman" w:hAnsi="Times New Roman" w:cs="Times New Roman"/>
+          <w:sz w:val="20"/>
+          <w:szCs w:val="20"/>
+          <w:lang w:val="en-US"/>
+        </w:rPr>
+        <w:t>. An assignment of refrence mutational signatures from COSMIC</w:t>
+      </w:r>
+      <w:r>
+        <w:rPr>
+          <w:rFonts w:ascii="Times New Roman" w:hAnsi="Times New Roman" w:cs="Times New Roman"/>
+          <w:sz w:val="20"/>
+          <w:szCs w:val="20"/>
+          <w:lang w:val="en-US"/>
+        </w:rPr>
+        <w:t xml:space="preserve">, </w:t>
+      </w:r>
+      <w:r>
+        <w:rPr>
+          <w:rFonts w:ascii="Times New Roman" w:hAnsi="Times New Roman" w:cs="Times New Roman"/>
+          <w:sz w:val="20"/>
+          <w:szCs w:val="20"/>
+          <w:lang w:val="en-US"/>
+        </w:rPr>
+        <w:t xml:space="preserve">the descomposition </w:t>
+      </w:r>
+      <w:r>
+        <w:rPr>
+          <w:rFonts w:ascii="Times New Roman" w:hAnsi="Times New Roman" w:cs="Times New Roman"/>
+          <w:sz w:val="20"/>
+          <w:szCs w:val="20"/>
+          <w:lang w:val="en-US"/>
+        </w:rPr>
+        <w:t xml:space="preserve">plots </w:t>
+      </w:r>
+      <w:r>
+        <w:rPr>
+          <w:rFonts w:ascii="Times New Roman" w:hAnsi="Times New Roman" w:cs="Times New Roman"/>
+          <w:sz w:val="20"/>
+          <w:szCs w:val="20"/>
+          <w:lang w:val="en-US"/>
+        </w:rPr>
+        <w:t>of the de novo signatures</w:t>
+      </w:r>
+      <w:r>
+        <w:rPr>
+          <w:rFonts w:ascii="Times New Roman" w:hAnsi="Times New Roman" w:cs="Times New Roman"/>
+          <w:sz w:val="20"/>
+          <w:szCs w:val="20"/>
+          <w:lang w:val="en-US"/>
+        </w:rPr>
+        <w:t xml:space="preserve"> and the an assesment of the accuary of the reconsruction of mutational profiles </w:t>
+      </w:r>
+      <w:r>
+        <w:rPr>
+          <w:rFonts w:ascii="Times New Roman" w:hAnsi="Times New Roman" w:cs="Times New Roman"/>
+          <w:sz w:val="20"/>
+          <w:szCs w:val="20"/>
+          <w:lang w:val="en-US"/>
+        </w:rPr>
+        <w:t>by cosine similarity</w:t>
+      </w:r>
+      <w:r>
+        <w:rPr>
+          <w:rFonts w:ascii="Times New Roman" w:hAnsi="Times New Roman" w:cs="Times New Roman"/>
+          <w:sz w:val="20"/>
+          <w:szCs w:val="20"/>
+          <w:lang w:val="en-US"/>
+        </w:rPr>
+        <w:t xml:space="preserve"> was performed using </w:t>
+      </w:r>
+      <w:r>
+        <w:rPr>
+          <w:rFonts w:ascii="Times New Roman" w:hAnsi="Times New Roman" w:cs="Times New Roman"/>
+          <w:sz w:val="20"/>
+          <w:szCs w:val="20"/>
+          <w:lang w:val="en-US"/>
+        </w:rPr>
+        <w:t>SigProfilerAssignmentR version 1.1.3.</w:t>
+      </w:r>
+      <w:r>
+        <w:rPr>
+          <w:rFonts w:ascii="Times New Roman" w:hAnsi="Times New Roman" w:cs="Times New Roman"/>
+          <w:sz w:val="20"/>
+          <w:szCs w:val="20"/>
+          <w:lang w:val="en-US"/>
+        </w:rPr>
+        <w:t xml:space="preserve"> Further analysis of the data obtained by the SigProfilerExtractor was done to obtain the </w:t>
+      </w:r>
+      <w:r>
+        <w:rPr>
+          <w:rFonts w:ascii="Times New Roman" w:hAnsi="Times New Roman" w:cs="Times New Roman"/>
+          <w:sz w:val="20"/>
+          <w:szCs w:val="20"/>
+          <w:lang w:val="en-US"/>
+        </w:rPr>
+        <w:t>signatures with the most activity</w:t>
+      </w:r>
+      <w:r>
+        <w:rPr>
+          <w:rFonts w:ascii="Times New Roman" w:hAnsi="Times New Roman" w:cs="Times New Roman"/>
+          <w:sz w:val="20"/>
+          <w:szCs w:val="20"/>
+          <w:lang w:val="en-US"/>
+        </w:rPr>
+        <w:t xml:space="preserve"> and the signature activity of each sample.</w:t>
+      </w:r>
+      <w:r>
+        <w:rPr>
+          <w:rFonts w:ascii="Times New Roman" w:hAnsi="Times New Roman" w:cs="Times New Roman"/>
+          <w:sz w:val="20"/>
+          <w:szCs w:val="20"/>
+          <w:lang w:val="en-US"/>
         </w:rPr>
         <w:t xml:space="preserve"> </w:t>
       </w:r>
       <w:r>
-        <w:t>and mapped to COSMIC signatures were obtained with the R package SigProfilerExtractorR version 1.2.6, the maximum number of signatures was set to 5 because of high runing time for greater numbers of signatures, and a number of NMF of 100 to get stable results</w:t>
-      </w:r>
-      <w:r>
-        <w:t>. An assignment of refrence mutational signatures from COSMIC</w:t>
-      </w:r>
-      <w:r>
-        <w:t xml:space="preserve">, </w:t>
-      </w:r>
-      <w:r>
-        <w:t xml:space="preserve">the descomposition </w:t>
-      </w:r>
-      <w:r>
-        <w:t xml:space="preserve">plots </w:t>
-      </w:r>
-      <w:r>
-        <w:t xml:space="preserve">of the </w:t>
-      </w:r>
-      <w:r>
-        <w:rPr>
-          <w:i/>
-          <w:iCs/>
-        </w:rPr>
-        <w:t>de novo</w:t>
-      </w:r>
-      <w:r>
-        <w:t xml:space="preserve"> signatures</w:t>
-      </w:r>
-      <w:r>
-        <w:t xml:space="preserve"> and the an assesment of the accuary of the reconsruction of mutational profiles </w:t>
-      </w:r>
-      <w:r>
-        <w:t>by cosine similarity</w:t>
-      </w:r>
-      <w:r>
-        <w:t xml:space="preserve"> was performed using </w:t>
-      </w:r>
-      <w:r>
-        <w:t>SigProfilerAssignmentR version 1.1.3.</w:t>
-      </w:r>
-      <w:r>
-        <w:t xml:space="preserve"> Further analysis of the data obtained by the SigProfilerExtractor was done to obtain the </w:t>
-      </w:r>
-      <w:r>
-        <w:t>signatures with the most activity</w:t>
-      </w:r>
-      <w:r>
-        <w:t xml:space="preserve"> and the signature activity of each sample.</w:t>
-      </w:r>
-      <w:r>
-        <w:t xml:space="preserve"> From the dirver genes found in this research</w:t>
-      </w:r>
-      <w:r>
+        <w:rPr>
+          <w:rFonts w:ascii="Times New Roman" w:hAnsi="Times New Roman" w:cs="Times New Roman"/>
+          <w:sz w:val="20"/>
+          <w:szCs w:val="20"/>
+          <w:lang w:val="en-US"/>
+        </w:rPr>
+        <w:t xml:space="preserve">The summary information of the mutational signatures was assessed in the COSMIC Mutational Signatures database. </w:t>
+      </w:r>
+      <w:r>
+        <w:rPr>
+          <w:rFonts w:ascii="Times New Roman" w:hAnsi="Times New Roman" w:cs="Times New Roman"/>
+          <w:sz w:val="20"/>
+          <w:szCs w:val="20"/>
+          <w:lang w:val="en-US"/>
+        </w:rPr>
+        <w:t>Fro</w:t>
+      </w:r>
+      <w:r>
+        <w:rPr>
+          <w:rFonts w:ascii="Times New Roman" w:hAnsi="Times New Roman" w:cs="Times New Roman"/>
+          <w:sz w:val="20"/>
+          <w:szCs w:val="20"/>
+          <w:lang w:val="en-US"/>
+        </w:rPr>
+        <w:t>m</w:t>
+      </w:r>
+      <w:r>
+        <w:rPr>
+          <w:rFonts w:ascii="Times New Roman" w:hAnsi="Times New Roman" w:cs="Times New Roman"/>
+          <w:sz w:val="20"/>
+          <w:szCs w:val="20"/>
+          <w:lang w:val="en-US"/>
+        </w:rPr>
+        <w:t xml:space="preserve"> the </w:t>
+      </w:r>
+      <w:r>
+        <w:rPr>
+          <w:rFonts w:ascii="Times New Roman" w:hAnsi="Times New Roman" w:cs="Times New Roman"/>
+          <w:sz w:val="20"/>
+          <w:szCs w:val="20"/>
+          <w:lang w:val="en-US"/>
+        </w:rPr>
+        <w:t>driver</w:t>
+      </w:r>
+      <w:r>
+        <w:rPr>
+          <w:rFonts w:ascii="Times New Roman" w:hAnsi="Times New Roman" w:cs="Times New Roman"/>
+          <w:sz w:val="20"/>
+          <w:szCs w:val="20"/>
+          <w:lang w:val="en-US"/>
+        </w:rPr>
+        <w:t xml:space="preserve"> genes found in this research</w:t>
+      </w:r>
+      <w:r>
+        <w:rPr>
+          <w:rFonts w:ascii="Times New Roman" w:hAnsi="Times New Roman" w:cs="Times New Roman"/>
+          <w:sz w:val="20"/>
+          <w:szCs w:val="20"/>
+          <w:lang w:val="en-US"/>
+        </w:rPr>
         <w:t>, the two oncogenes, two of the most important tumor supressors and a putative gene were selected to obtain the mutational burden of the samples that contain mutations in a position range based on hotspots found in COSMIC and the location of important regions or domains.</w:t>
       </w:r>
     </w:p>
@@ -161,26 +379,40 @@
     <w:p>
       <w:pPr>
         <w:pStyle w:val="Heading1"/>
-        <w:rPr>
+        <w:spacing w:line="480" w:lineRule="auto"/>
+        <w:rPr>
+          <w:rFonts w:ascii="Times New Roman" w:hAnsi="Times New Roman" w:cs="Times New Roman"/>
           <w:lang w:val="en-US"/>
         </w:rPr>
       </w:pPr>
       <w:r>
         <w:rPr>
-          <w:lang w:val="en-US"/>
-        </w:rPr>
+          <w:rFonts w:ascii="Times New Roman" w:hAnsi="Times New Roman" w:cs="Times New Roman"/>
+          <w:lang w:val="en-US"/>
+        </w:rPr>
+        <w:lastRenderedPageBreak/>
         <w:t>Result</w:t>
+      </w:r>
+      <w:r>
+        <w:rPr>
+          <w:rFonts w:ascii="Times New Roman" w:hAnsi="Times New Roman" w:cs="Times New Roman"/>
+          <w:lang w:val="en-US"/>
+        </w:rPr>
+        <w:t>s</w:t>
       </w:r>
     </w:p>
     <w:p>
       <w:pPr>
         <w:pStyle w:val="Heading2"/>
-        <w:rPr>
+        <w:spacing w:line="480" w:lineRule="auto"/>
+        <w:rPr>
+          <w:rFonts w:ascii="Times New Roman" w:hAnsi="Times New Roman" w:cs="Times New Roman"/>
           <w:lang w:val="en-US"/>
         </w:rPr>
       </w:pPr>
       <w:r>
         <w:rPr>
+          <w:rFonts w:ascii="Times New Roman" w:hAnsi="Times New Roman" w:cs="Times New Roman"/>
           <w:lang w:val="en-US"/>
         </w:rPr>
         <w:t>Mutational Signatures</w:t>
@@ -188,262 +420,1212 @@
     </w:p>
     <w:p>
       <w:pPr>
+        <w:spacing w:line="480" w:lineRule="auto"/>
         <w:jc w:val="both"/>
         <w:rPr>
+          <w:rFonts w:ascii="Times New Roman" w:hAnsi="Times New Roman" w:cs="Times New Roman"/>
+          <w:sz w:val="20"/>
+          <w:szCs w:val="20"/>
           <w:lang w:val="en-US"/>
         </w:rPr>
       </w:pPr>
       <w:r>
         <w:rPr>
+          <w:rFonts w:ascii="Times New Roman" w:hAnsi="Times New Roman" w:cs="Times New Roman"/>
+          <w:sz w:val="20"/>
+          <w:szCs w:val="20"/>
           <w:lang w:val="en-US"/>
         </w:rPr>
         <w:t>A mutational signatur</w:t>
       </w:r>
       <w:r>
         <w:rPr>
+          <w:rFonts w:ascii="Times New Roman" w:hAnsi="Times New Roman" w:cs="Times New Roman"/>
+          <w:sz w:val="20"/>
+          <w:szCs w:val="20"/>
           <w:lang w:val="en-US"/>
         </w:rPr>
         <w:t>e</w:t>
       </w:r>
       <w:r>
         <w:rPr>
+          <w:rFonts w:ascii="Times New Roman" w:hAnsi="Times New Roman" w:cs="Times New Roman"/>
+          <w:sz w:val="20"/>
+          <w:szCs w:val="20"/>
           <w:lang w:val="en-US"/>
         </w:rPr>
         <w:t xml:space="preserve"> </w:t>
       </w:r>
+      <w:r>
+        <w:rPr>
+          <w:rFonts w:ascii="Times New Roman" w:hAnsi="Times New Roman" w:cs="Times New Roman"/>
+          <w:sz w:val="20"/>
+          <w:szCs w:val="20"/>
+          <w:lang w:val="en-US"/>
+        </w:rPr>
+        <w:t>analysis</w:t>
+      </w:r>
+      <w:r>
+        <w:rPr>
+          <w:rFonts w:ascii="Times New Roman" w:hAnsi="Times New Roman" w:cs="Times New Roman"/>
+          <w:sz w:val="20"/>
+          <w:szCs w:val="20"/>
+          <w:lang w:val="en-US"/>
+        </w:rPr>
+        <w:t xml:space="preserve"> was performed using the packages from </w:t>
+      </w:r>
       <w:proofErr w:type="spellStart"/>
       <w:r>
         <w:rPr>
-          <w:lang w:val="en-US"/>
-        </w:rPr>
-        <w:t>analysis</w:t>
+          <w:rFonts w:ascii="Times New Roman" w:hAnsi="Times New Roman" w:cs="Times New Roman"/>
+          <w:sz w:val="20"/>
+          <w:szCs w:val="20"/>
+          <w:lang w:val="en-US"/>
+        </w:rPr>
+        <w:t>SigProfiler</w:t>
       </w:r>
       <w:proofErr w:type="spellEnd"/>
       <w:r>
         <w:rPr>
-          <w:lang w:val="en-US"/>
-        </w:rPr>
-        <w:t xml:space="preserve"> was performed </w:t>
-      </w:r>
-      <w:r>
-        <w:rPr>
-          <w:lang w:val="en-US"/>
-        </w:rPr>
-        <w:t xml:space="preserve">using the packages from </w:t>
+          <w:rFonts w:ascii="Times New Roman" w:hAnsi="Times New Roman" w:cs="Times New Roman"/>
+          <w:sz w:val="20"/>
+          <w:szCs w:val="20"/>
+          <w:lang w:val="en-US"/>
+        </w:rPr>
+        <w:t xml:space="preserve"> in R</w:t>
+      </w:r>
+      <w:r>
+        <w:rPr>
+          <w:rFonts w:ascii="Times New Roman" w:hAnsi="Times New Roman" w:cs="Times New Roman"/>
+          <w:sz w:val="20"/>
+          <w:szCs w:val="20"/>
+          <w:lang w:val="en-US"/>
+        </w:rPr>
+        <w:t xml:space="preserve"> as set to obtain the mutational profiles of the samples in our cohort and to search for a specific group of mutational signatures reported to be correspondent to liver hepatocarcinoma.</w:t>
+      </w:r>
+      <w:r>
+        <w:rPr>
+          <w:rFonts w:ascii="Times New Roman" w:hAnsi="Times New Roman" w:cs="Times New Roman"/>
+          <w:sz w:val="20"/>
+          <w:szCs w:val="20"/>
+          <w:lang w:val="en-US"/>
+        </w:rPr>
+        <w:t xml:space="preserve"> The results obtained are of mutations type SBS96 as a simpler and more documented analysis in the literature.</w:t>
+      </w:r>
+      <w:r>
+        <w:rPr>
+          <w:rFonts w:ascii="Times New Roman" w:hAnsi="Times New Roman" w:cs="Times New Roman"/>
+          <w:sz w:val="20"/>
+          <w:szCs w:val="20"/>
+          <w:lang w:val="en-US"/>
+        </w:rPr>
+        <w:t xml:space="preserve"> The average mutational profile of the whole cohort contains four focal points</w:t>
+      </w:r>
+      <w:r>
+        <w:rPr>
+          <w:rFonts w:ascii="Times New Roman" w:hAnsi="Times New Roman" w:cs="Times New Roman"/>
+          <w:sz w:val="20"/>
+          <w:szCs w:val="20"/>
+          <w:lang w:val="en-US"/>
+        </w:rPr>
+        <w:t xml:space="preserve"> (</w:t>
+      </w:r>
+      <w:r>
+        <w:rPr>
+          <w:rFonts w:ascii="Times New Roman" w:hAnsi="Times New Roman" w:cs="Times New Roman"/>
+          <w:sz w:val="20"/>
+          <w:szCs w:val="20"/>
+          <w:lang w:val="en-US"/>
+        </w:rPr>
+        <w:t>F</w:t>
+      </w:r>
+      <w:r>
+        <w:rPr>
+          <w:rFonts w:ascii="Times New Roman" w:hAnsi="Times New Roman" w:cs="Times New Roman"/>
+          <w:sz w:val="20"/>
+          <w:szCs w:val="20"/>
+          <w:lang w:val="en-US"/>
+        </w:rPr>
+        <w:t xml:space="preserve">ig. </w:t>
+      </w:r>
+      <w:r>
+        <w:rPr>
+          <w:rFonts w:ascii="Times New Roman" w:hAnsi="Times New Roman" w:cs="Times New Roman"/>
+          <w:sz w:val="20"/>
+          <w:szCs w:val="20"/>
+          <w:lang w:val="en-US"/>
+        </w:rPr>
+        <w:t>A</w:t>
+      </w:r>
+      <w:r>
+        <w:rPr>
+          <w:rFonts w:ascii="Times New Roman" w:hAnsi="Times New Roman" w:cs="Times New Roman"/>
+          <w:sz w:val="20"/>
+          <w:szCs w:val="20"/>
+          <w:lang w:val="en-US"/>
+        </w:rPr>
+        <w:t>)</w:t>
+      </w:r>
+      <w:r>
+        <w:rPr>
+          <w:rFonts w:ascii="Times New Roman" w:hAnsi="Times New Roman" w:cs="Times New Roman"/>
+          <w:sz w:val="20"/>
+          <w:szCs w:val="20"/>
+          <w:lang w:val="en-US"/>
+        </w:rPr>
+        <w:t>, the most notable being C&gt;T transitions</w:t>
+      </w:r>
+      <w:r>
+        <w:rPr>
+          <w:rFonts w:ascii="Times New Roman" w:hAnsi="Times New Roman" w:cs="Times New Roman"/>
+          <w:sz w:val="20"/>
+          <w:szCs w:val="20"/>
+          <w:lang w:val="en-US"/>
+        </w:rPr>
+        <w:t xml:space="preserve">, containing the three highest activity signatures of which </w:t>
+      </w:r>
+      <w:r>
+        <w:rPr>
+          <w:rFonts w:ascii="Times New Roman" w:hAnsi="Times New Roman" w:cs="Times New Roman"/>
+          <w:sz w:val="20"/>
+          <w:szCs w:val="20"/>
+          <w:lang w:val="en-US"/>
+        </w:rPr>
+        <w:t xml:space="preserve">mutations at </w:t>
+      </w:r>
+      <w:r>
+        <w:rPr>
+          <w:rFonts w:ascii="Times New Roman" w:hAnsi="Times New Roman" w:cs="Times New Roman"/>
+          <w:sz w:val="20"/>
+          <w:szCs w:val="20"/>
+          <w:lang w:val="en-US"/>
+        </w:rPr>
+        <w:t>G</w:t>
+      </w:r>
+      <w:r>
+        <w:rPr>
+          <w:rFonts w:ascii="Times New Roman" w:hAnsi="Times New Roman" w:cs="Times New Roman"/>
+          <w:sz w:val="20"/>
+          <w:szCs w:val="20"/>
+          <w:lang w:val="en-US"/>
+        </w:rPr>
+        <w:t>C</w:t>
+      </w:r>
+      <w:r>
+        <w:rPr>
+          <w:rFonts w:ascii="Times New Roman" w:hAnsi="Times New Roman" w:cs="Times New Roman"/>
+          <w:sz w:val="20"/>
+          <w:szCs w:val="20"/>
+          <w:lang w:val="en-US"/>
+        </w:rPr>
+        <w:t xml:space="preserve">G </w:t>
+      </w:r>
+      <w:r>
+        <w:rPr>
+          <w:rFonts w:ascii="Times New Roman" w:hAnsi="Times New Roman" w:cs="Times New Roman"/>
+          <w:sz w:val="20"/>
+          <w:szCs w:val="20"/>
+          <w:lang w:val="en-US"/>
+        </w:rPr>
+        <w:t>trinucleotide contexts</w:t>
+      </w:r>
+      <w:r>
+        <w:rPr>
+          <w:rFonts w:ascii="Times New Roman" w:hAnsi="Times New Roman" w:cs="Times New Roman"/>
+          <w:sz w:val="20"/>
+          <w:szCs w:val="20"/>
+          <w:lang w:val="en-US"/>
+        </w:rPr>
+        <w:t xml:space="preserve"> which corresponds to the highest frequency signature; then C&gt;A and T&gt;C transitions have similar frequencies and T&gt;A transition </w:t>
+      </w:r>
+      <w:r>
+        <w:rPr>
+          <w:rFonts w:ascii="Times New Roman" w:hAnsi="Times New Roman" w:cs="Times New Roman"/>
+          <w:sz w:val="20"/>
+          <w:szCs w:val="20"/>
+          <w:lang w:val="en-US"/>
+        </w:rPr>
+        <w:t>at</w:t>
+      </w:r>
+      <w:r>
+        <w:rPr>
+          <w:rFonts w:ascii="Times New Roman" w:hAnsi="Times New Roman" w:cs="Times New Roman"/>
+          <w:sz w:val="20"/>
+          <w:szCs w:val="20"/>
+          <w:lang w:val="en-US"/>
+        </w:rPr>
+        <w:t xml:space="preserve"> C</w:t>
+      </w:r>
+      <w:r>
+        <w:rPr>
+          <w:rFonts w:ascii="Times New Roman" w:hAnsi="Times New Roman" w:cs="Times New Roman"/>
+          <w:sz w:val="20"/>
+          <w:szCs w:val="20"/>
+          <w:lang w:val="en-US"/>
+        </w:rPr>
+        <w:t>T</w:t>
+      </w:r>
+      <w:r>
+        <w:rPr>
+          <w:rFonts w:ascii="Times New Roman" w:hAnsi="Times New Roman" w:cs="Times New Roman"/>
+          <w:sz w:val="20"/>
+          <w:szCs w:val="20"/>
+          <w:lang w:val="en-US"/>
+        </w:rPr>
+        <w:t xml:space="preserve">G </w:t>
+      </w:r>
+      <w:r>
+        <w:rPr>
+          <w:rFonts w:ascii="Times New Roman" w:hAnsi="Times New Roman" w:cs="Times New Roman"/>
+          <w:sz w:val="20"/>
+          <w:szCs w:val="20"/>
+          <w:lang w:val="en-US"/>
+        </w:rPr>
+        <w:t>trinucleotide contexts</w:t>
+      </w:r>
+      <w:r>
+        <w:rPr>
+          <w:rFonts w:ascii="Times New Roman" w:hAnsi="Times New Roman" w:cs="Times New Roman"/>
+          <w:sz w:val="20"/>
+          <w:szCs w:val="20"/>
+          <w:lang w:val="en-US"/>
+        </w:rPr>
+        <w:t xml:space="preserve"> have the fourth highest frequency.</w:t>
+      </w:r>
+      <w:r>
+        <w:rPr>
+          <w:rFonts w:ascii="Times New Roman" w:hAnsi="Times New Roman" w:cs="Times New Roman"/>
+          <w:sz w:val="20"/>
+          <w:szCs w:val="20"/>
+          <w:lang w:val="en-US"/>
+        </w:rPr>
+        <w:t xml:space="preserve"> No subgroups were reported in the clinical dataset, so no further analysis was done. Five </w:t>
+      </w:r>
+      <w:r>
+        <w:rPr>
+          <w:rFonts w:ascii="Times New Roman" w:hAnsi="Times New Roman" w:cs="Times New Roman"/>
+          <w:i/>
+          <w:iCs/>
+          <w:sz w:val="20"/>
+          <w:szCs w:val="20"/>
+          <w:lang w:val="en-US"/>
+        </w:rPr>
+        <w:t xml:space="preserve">de novo </w:t>
+      </w:r>
+      <w:r>
+        <w:rPr>
+          <w:rFonts w:ascii="Times New Roman" w:hAnsi="Times New Roman" w:cs="Times New Roman"/>
+          <w:sz w:val="20"/>
+          <w:szCs w:val="20"/>
+          <w:lang w:val="en-US"/>
+        </w:rPr>
+        <w:t xml:space="preserve">mutational signatures were obtained by </w:t>
       </w:r>
       <w:proofErr w:type="spellStart"/>
       <w:r>
         <w:rPr>
-          <w:lang w:val="en-US"/>
-        </w:rPr>
-        <w:t>SigProfiler</w:t>
+          <w:rFonts w:ascii="Times New Roman" w:hAnsi="Times New Roman" w:cs="Times New Roman"/>
+          <w:sz w:val="20"/>
+          <w:szCs w:val="20"/>
+          <w:lang w:val="en-US"/>
+        </w:rPr>
+        <w:t>SigProfilerExtractorR</w:t>
       </w:r>
       <w:proofErr w:type="spellEnd"/>
       <w:r>
         <w:rPr>
-          <w:lang w:val="en-US"/>
-        </w:rPr>
-        <w:t xml:space="preserve"> in R</w:t>
-      </w:r>
-      <w:r>
-        <w:rPr>
-          <w:lang w:val="en-US"/>
-        </w:rPr>
-        <w:t xml:space="preserve"> as set to obtain the mutational profiles of the samples in our cohort and to search for a specific group of mutational signatures reported to be correspondent to liver hepatocarcinoma.</w:t>
+          <w:rFonts w:ascii="Times New Roman" w:hAnsi="Times New Roman" w:cs="Times New Roman"/>
+          <w:sz w:val="20"/>
+          <w:szCs w:val="20"/>
+          <w:lang w:val="en-US"/>
+        </w:rPr>
+        <w:t xml:space="preserve"> with a variable range of stability (0.57 – 0.99) (</w:t>
+      </w:r>
+      <w:r>
+        <w:rPr>
+          <w:rFonts w:ascii="Times New Roman" w:hAnsi="Times New Roman" w:cs="Times New Roman"/>
+          <w:sz w:val="20"/>
+          <w:szCs w:val="20"/>
+          <w:lang w:val="en-US"/>
+        </w:rPr>
+        <w:t>Supplemental</w:t>
+      </w:r>
+      <w:r>
+        <w:rPr>
+          <w:rFonts w:ascii="Times New Roman" w:hAnsi="Times New Roman" w:cs="Times New Roman"/>
+          <w:sz w:val="20"/>
+          <w:szCs w:val="20"/>
+          <w:lang w:val="en-US"/>
+        </w:rPr>
+        <w:t xml:space="preserve"> fig</w:t>
+      </w:r>
+      <w:r>
+        <w:rPr>
+          <w:rFonts w:ascii="Times New Roman" w:hAnsi="Times New Roman" w:cs="Times New Roman"/>
+          <w:sz w:val="20"/>
+          <w:szCs w:val="20"/>
+          <w:lang w:val="en-US"/>
+        </w:rPr>
+        <w:t>.</w:t>
+      </w:r>
+      <w:r>
+        <w:rPr>
+          <w:rFonts w:ascii="Times New Roman" w:hAnsi="Times New Roman" w:cs="Times New Roman"/>
+          <w:sz w:val="20"/>
+          <w:szCs w:val="20"/>
+          <w:lang w:val="en-US"/>
+        </w:rPr>
+        <w:t xml:space="preserve"> </w:t>
+      </w:r>
+      <w:r>
+        <w:rPr>
+          <w:rFonts w:ascii="Times New Roman" w:hAnsi="Times New Roman" w:cs="Times New Roman"/>
+          <w:sz w:val="20"/>
+          <w:szCs w:val="20"/>
+          <w:lang w:val="en-US"/>
+        </w:rPr>
+        <w:t>a</w:t>
+      </w:r>
+      <w:r>
+        <w:rPr>
+          <w:rFonts w:ascii="Times New Roman" w:hAnsi="Times New Roman" w:cs="Times New Roman"/>
+          <w:sz w:val="20"/>
+          <w:szCs w:val="20"/>
+          <w:lang w:val="en-US"/>
+        </w:rPr>
+        <w:t xml:space="preserve">), of which the signature SBS96E has the most stability (0.99) and is characterized by the signature activity of the transition T&gt;A </w:t>
+      </w:r>
+      <w:r>
+        <w:rPr>
+          <w:rFonts w:ascii="Times New Roman" w:hAnsi="Times New Roman" w:cs="Times New Roman"/>
+          <w:sz w:val="20"/>
+          <w:szCs w:val="20"/>
+          <w:lang w:val="en-US"/>
+        </w:rPr>
+        <w:t xml:space="preserve">at CTG trinucleotide contexts reflecting the contribution of that signature to the average mutational profile; in the decomposition plot this </w:t>
+      </w:r>
+      <w:r>
+        <w:rPr>
+          <w:rFonts w:ascii="Times New Roman" w:hAnsi="Times New Roman" w:cs="Times New Roman"/>
+          <w:i/>
+          <w:iCs/>
+          <w:sz w:val="20"/>
+          <w:szCs w:val="20"/>
+          <w:lang w:val="en-US"/>
+        </w:rPr>
+        <w:t xml:space="preserve">de novo </w:t>
+      </w:r>
+      <w:r>
+        <w:rPr>
+          <w:rFonts w:ascii="Times New Roman" w:hAnsi="Times New Roman" w:cs="Times New Roman"/>
+          <w:sz w:val="20"/>
+          <w:szCs w:val="20"/>
+          <w:lang w:val="en-US"/>
+        </w:rPr>
+        <w:t xml:space="preserve">signature is comprised mainly (89.62%) from the SBS22a signature, corresponding to the highest </w:t>
+      </w:r>
+      <w:r>
+        <w:rPr>
+          <w:rFonts w:ascii="Times New Roman" w:hAnsi="Times New Roman" w:cs="Times New Roman"/>
+          <w:sz w:val="20"/>
+          <w:szCs w:val="20"/>
+          <w:lang w:val="en-US"/>
+        </w:rPr>
+        <w:t xml:space="preserve">contribution among all of the </w:t>
+      </w:r>
+      <w:r>
+        <w:rPr>
+          <w:rFonts w:ascii="Times New Roman" w:hAnsi="Times New Roman" w:cs="Times New Roman"/>
+          <w:i/>
+          <w:iCs/>
+          <w:sz w:val="20"/>
+          <w:szCs w:val="20"/>
+          <w:lang w:val="en-US"/>
+        </w:rPr>
+        <w:t xml:space="preserve">de novo </w:t>
+      </w:r>
+      <w:r>
+        <w:rPr>
+          <w:rFonts w:ascii="Times New Roman" w:hAnsi="Times New Roman" w:cs="Times New Roman"/>
+          <w:sz w:val="20"/>
+          <w:szCs w:val="20"/>
+          <w:lang w:val="en-US"/>
+        </w:rPr>
+        <w:t>decompositions (</w:t>
+      </w:r>
+      <w:r>
+        <w:rPr>
+          <w:rFonts w:ascii="Times New Roman" w:hAnsi="Times New Roman" w:cs="Times New Roman"/>
+          <w:sz w:val="20"/>
+          <w:szCs w:val="20"/>
+          <w:lang w:val="en-US"/>
+        </w:rPr>
+        <w:t>Supplemental</w:t>
+      </w:r>
+      <w:r>
+        <w:rPr>
+          <w:rFonts w:ascii="Times New Roman" w:hAnsi="Times New Roman" w:cs="Times New Roman"/>
+          <w:sz w:val="20"/>
+          <w:szCs w:val="20"/>
+          <w:lang w:val="en-US"/>
+        </w:rPr>
+        <w:t xml:space="preserve"> fig</w:t>
+      </w:r>
+      <w:r>
+        <w:rPr>
+          <w:rFonts w:ascii="Times New Roman" w:hAnsi="Times New Roman" w:cs="Times New Roman"/>
+          <w:sz w:val="20"/>
+          <w:szCs w:val="20"/>
+          <w:lang w:val="en-US"/>
+        </w:rPr>
+        <w:t>.</w:t>
+      </w:r>
+      <w:r>
+        <w:rPr>
+          <w:rFonts w:ascii="Times New Roman" w:hAnsi="Times New Roman" w:cs="Times New Roman"/>
+          <w:sz w:val="20"/>
+          <w:szCs w:val="20"/>
+          <w:lang w:val="en-US"/>
+        </w:rPr>
+        <w:t xml:space="preserve"> b)</w:t>
+      </w:r>
+      <w:r>
+        <w:rPr>
+          <w:rFonts w:ascii="Times New Roman" w:hAnsi="Times New Roman" w:cs="Times New Roman"/>
+          <w:sz w:val="20"/>
+          <w:szCs w:val="20"/>
+          <w:lang w:val="en-US"/>
+        </w:rPr>
+        <w:t>.</w:t>
+      </w:r>
+      <w:r>
+        <w:rPr>
+          <w:rFonts w:ascii="Times New Roman" w:hAnsi="Times New Roman" w:cs="Times New Roman"/>
+          <w:sz w:val="20"/>
+          <w:szCs w:val="20"/>
+          <w:lang w:val="en-US"/>
+        </w:rPr>
+        <w:t xml:space="preserve"> Another notably </w:t>
+      </w:r>
+      <w:r>
+        <w:rPr>
+          <w:rFonts w:ascii="Times New Roman" w:hAnsi="Times New Roman" w:cs="Times New Roman"/>
+          <w:i/>
+          <w:iCs/>
+          <w:sz w:val="20"/>
+          <w:szCs w:val="20"/>
+          <w:lang w:val="en-US"/>
+        </w:rPr>
+        <w:t xml:space="preserve">de novo </w:t>
+      </w:r>
+      <w:r>
+        <w:rPr>
+          <w:rFonts w:ascii="Times New Roman" w:hAnsi="Times New Roman" w:cs="Times New Roman"/>
+          <w:sz w:val="20"/>
+          <w:szCs w:val="20"/>
+          <w:lang w:val="en-US"/>
+        </w:rPr>
+        <w:t xml:space="preserve">signature is SBS96A which presents a high contribution of C&gt;T transitions and a low and balanced contribution of C&gt;A, C&gt;G and T&gt;C transitions, </w:t>
+      </w:r>
+      <w:r>
+        <w:rPr>
+          <w:rFonts w:ascii="Times New Roman" w:hAnsi="Times New Roman" w:cs="Times New Roman"/>
+          <w:sz w:val="20"/>
+          <w:szCs w:val="20"/>
+          <w:lang w:val="en-US"/>
+        </w:rPr>
+        <w:t xml:space="preserve">it represents the highest contribution of the total mutations (25.8%) among all the </w:t>
+      </w:r>
+      <w:r>
+        <w:rPr>
+          <w:rFonts w:ascii="Times New Roman" w:hAnsi="Times New Roman" w:cs="Times New Roman"/>
+          <w:i/>
+          <w:iCs/>
+          <w:sz w:val="20"/>
+          <w:szCs w:val="20"/>
+          <w:lang w:val="en-US"/>
+        </w:rPr>
+        <w:t xml:space="preserve">de novo </w:t>
+      </w:r>
+      <w:r>
+        <w:rPr>
+          <w:rFonts w:ascii="Times New Roman" w:hAnsi="Times New Roman" w:cs="Times New Roman"/>
+          <w:sz w:val="20"/>
+          <w:szCs w:val="20"/>
+          <w:lang w:val="en-US"/>
+        </w:rPr>
+        <w:t xml:space="preserve">signatures and </w:t>
+      </w:r>
+      <w:r>
+        <w:rPr>
+          <w:rFonts w:ascii="Times New Roman" w:hAnsi="Times New Roman" w:cs="Times New Roman"/>
+          <w:sz w:val="20"/>
+          <w:szCs w:val="20"/>
+          <w:lang w:val="en-US"/>
+        </w:rPr>
+        <w:t>resembles the most to the average mutational profile</w:t>
+      </w:r>
+      <w:r>
+        <w:rPr>
+          <w:rFonts w:ascii="Times New Roman" w:hAnsi="Times New Roman" w:cs="Times New Roman"/>
+          <w:sz w:val="20"/>
+          <w:szCs w:val="20"/>
+          <w:lang w:val="en-US"/>
+        </w:rPr>
+        <w:t>, but with the drawback of having the lowest stability (0.57); it is comprised in similar proportions of the signatures SBS40 a (50.7%) and SBS5 (49.3%).</w:t>
+      </w:r>
+      <w:r>
+        <w:rPr>
+          <w:rFonts w:ascii="Times New Roman" w:hAnsi="Times New Roman" w:cs="Times New Roman"/>
+          <w:sz w:val="20"/>
+          <w:szCs w:val="20"/>
+          <w:lang w:val="en-US"/>
+        </w:rPr>
+        <w:t xml:space="preserve"> Nine reported signatures from COSMIC </w:t>
+      </w:r>
+      <w:r>
+        <w:rPr>
+          <w:rFonts w:ascii="Times New Roman" w:hAnsi="Times New Roman" w:cs="Times New Roman"/>
+          <w:sz w:val="20"/>
+          <w:szCs w:val="20"/>
+          <w:lang w:val="en-US"/>
+        </w:rPr>
+        <w:t xml:space="preserve">(Supplemental </w:t>
+      </w:r>
+      <w:proofErr w:type="spellStart"/>
+      <w:r>
+        <w:rPr>
+          <w:rFonts w:ascii="Times New Roman" w:hAnsi="Times New Roman" w:cs="Times New Roman"/>
+          <w:sz w:val="20"/>
+          <w:szCs w:val="20"/>
+          <w:lang w:val="en-US"/>
+        </w:rPr>
+        <w:t>Fig.C</w:t>
+      </w:r>
+      <w:proofErr w:type="spellEnd"/>
+      <w:r>
+        <w:rPr>
+          <w:rFonts w:ascii="Times New Roman" w:hAnsi="Times New Roman" w:cs="Times New Roman"/>
+          <w:sz w:val="20"/>
+          <w:szCs w:val="20"/>
+          <w:lang w:val="en-US"/>
+        </w:rPr>
+        <w:t xml:space="preserve">) </w:t>
+      </w:r>
+      <w:r>
+        <w:rPr>
+          <w:rFonts w:ascii="Times New Roman" w:hAnsi="Times New Roman" w:cs="Times New Roman"/>
+          <w:sz w:val="20"/>
+          <w:szCs w:val="20"/>
+          <w:lang w:val="en-US"/>
+        </w:rPr>
+        <w:t xml:space="preserve">were selected by </w:t>
+      </w:r>
+      <w:proofErr w:type="spellStart"/>
+      <w:r>
+        <w:rPr>
+          <w:rFonts w:ascii="Times New Roman" w:hAnsi="Times New Roman" w:cs="Times New Roman"/>
+          <w:sz w:val="20"/>
+          <w:szCs w:val="20"/>
+          <w:lang w:val="en-US"/>
+        </w:rPr>
+        <w:t>SigProfilerExtractorR</w:t>
+      </w:r>
+      <w:proofErr w:type="spellEnd"/>
+      <w:r>
+        <w:rPr>
+          <w:rFonts w:ascii="Times New Roman" w:hAnsi="Times New Roman" w:cs="Times New Roman"/>
+          <w:sz w:val="20"/>
+          <w:szCs w:val="20"/>
+          <w:lang w:val="en-US"/>
+        </w:rPr>
+        <w:t xml:space="preserve"> (SBS1, SBS5, SBS12, SBS15, SBS16, SBS21, SBS22a, SBS40a and SBS95) </w:t>
+      </w:r>
+      <w:r>
+        <w:rPr>
+          <w:rFonts w:ascii="Times New Roman" w:hAnsi="Times New Roman" w:cs="Times New Roman"/>
+          <w:sz w:val="20"/>
+          <w:szCs w:val="20"/>
+          <w:lang w:val="en-US"/>
+        </w:rPr>
+        <w:t>as they had the most activity (Fig</w:t>
+      </w:r>
+      <w:r>
+        <w:rPr>
+          <w:rFonts w:ascii="Times New Roman" w:hAnsi="Times New Roman" w:cs="Times New Roman"/>
+          <w:sz w:val="20"/>
+          <w:szCs w:val="20"/>
+          <w:lang w:val="en-US"/>
+        </w:rPr>
+        <w:t>.</w:t>
+      </w:r>
+      <w:r>
+        <w:rPr>
+          <w:rFonts w:ascii="Times New Roman" w:hAnsi="Times New Roman" w:cs="Times New Roman"/>
+          <w:sz w:val="20"/>
+          <w:szCs w:val="20"/>
+          <w:lang w:val="en-US"/>
+        </w:rPr>
+        <w:t xml:space="preserve"> B</w:t>
+      </w:r>
+      <w:r>
+        <w:rPr>
+          <w:rFonts w:ascii="Times New Roman" w:hAnsi="Times New Roman" w:cs="Times New Roman"/>
+          <w:sz w:val="20"/>
+          <w:szCs w:val="20"/>
+          <w:lang w:val="en-US"/>
+        </w:rPr>
+        <w:t>a</w:t>
+      </w:r>
+      <w:r>
+        <w:rPr>
+          <w:rFonts w:ascii="Times New Roman" w:hAnsi="Times New Roman" w:cs="Times New Roman"/>
+          <w:sz w:val="20"/>
+          <w:szCs w:val="20"/>
+          <w:lang w:val="en-US"/>
+        </w:rPr>
+        <w:t xml:space="preserve">) of all signatures. </w:t>
+      </w:r>
+      <w:r>
+        <w:rPr>
+          <w:rFonts w:ascii="Times New Roman" w:hAnsi="Times New Roman" w:cs="Times New Roman"/>
+          <w:sz w:val="20"/>
+          <w:szCs w:val="20"/>
+          <w:lang w:val="en-US"/>
+        </w:rPr>
+        <w:t xml:space="preserve">The most activity is reported by the signatures SBS5, SBS40a and SBS22a (Fig. Bb). </w:t>
+      </w:r>
+      <w:r>
+        <w:rPr>
+          <w:rFonts w:ascii="Times New Roman" w:hAnsi="Times New Roman" w:cs="Times New Roman"/>
+          <w:sz w:val="20"/>
+          <w:szCs w:val="20"/>
+          <w:lang w:val="en-US"/>
+        </w:rPr>
+        <w:t xml:space="preserve">SBS5 </w:t>
+      </w:r>
+      <w:r>
+        <w:rPr>
+          <w:rFonts w:ascii="Times New Roman" w:hAnsi="Times New Roman" w:cs="Times New Roman"/>
+          <w:sz w:val="20"/>
+          <w:szCs w:val="20"/>
+          <w:lang w:val="en-US"/>
+        </w:rPr>
+        <w:t xml:space="preserve">is the signature with the most activity and is reported as an unknown </w:t>
+      </w:r>
+      <w:proofErr w:type="spellStart"/>
+      <w:r>
+        <w:rPr>
+          <w:rFonts w:ascii="Times New Roman" w:hAnsi="Times New Roman" w:cs="Times New Roman"/>
+          <w:sz w:val="20"/>
+          <w:szCs w:val="20"/>
+          <w:lang w:val="en-US"/>
+        </w:rPr>
+        <w:t>aetiology</w:t>
+      </w:r>
+      <w:proofErr w:type="spellEnd"/>
+      <w:r>
+        <w:rPr>
+          <w:rFonts w:ascii="Times New Roman" w:hAnsi="Times New Roman" w:cs="Times New Roman"/>
+          <w:sz w:val="20"/>
+          <w:szCs w:val="20"/>
+          <w:lang w:val="en-US"/>
+        </w:rPr>
+        <w:t>, mutational burden of this signature increases in many</w:t>
+      </w:r>
+      <w:r>
+        <w:rPr>
+          <w:rFonts w:ascii="Times New Roman" w:hAnsi="Times New Roman" w:cs="Times New Roman"/>
+          <w:sz w:val="20"/>
+          <w:szCs w:val="20"/>
+          <w:lang w:val="en-US"/>
+        </w:rPr>
+        <w:t xml:space="preserve"> cancer types due to tobacco smoking; rates of acquisition of SBS5 mutations increases over time; the median of the number of mutations per megabase by a activity </w:t>
+      </w:r>
+      <w:proofErr w:type="spellStart"/>
+      <w:r>
+        <w:rPr>
+          <w:rFonts w:ascii="Times New Roman" w:hAnsi="Times New Roman" w:cs="Times New Roman"/>
+          <w:sz w:val="20"/>
+          <w:szCs w:val="20"/>
+          <w:lang w:val="en-US"/>
+        </w:rPr>
+        <w:t>dotplot</w:t>
+      </w:r>
+      <w:proofErr w:type="spellEnd"/>
+      <w:r>
+        <w:rPr>
+          <w:rFonts w:ascii="Times New Roman" w:hAnsi="Times New Roman" w:cs="Times New Roman"/>
+          <w:sz w:val="20"/>
+          <w:szCs w:val="20"/>
+          <w:lang w:val="en-US"/>
+        </w:rPr>
+        <w:t xml:space="preserve"> is the eight highest among all cancers</w:t>
+      </w:r>
+      <w:r>
+        <w:rPr>
+          <w:rFonts w:ascii="Times New Roman" w:hAnsi="Times New Roman" w:cs="Times New Roman"/>
+          <w:sz w:val="20"/>
+          <w:szCs w:val="20"/>
+          <w:lang w:val="en-US"/>
+        </w:rPr>
+        <w:t>; also it may contain contamination from SBS16</w:t>
+      </w:r>
+      <w:r>
+        <w:rPr>
+          <w:rFonts w:ascii="Times New Roman" w:hAnsi="Times New Roman" w:cs="Times New Roman"/>
+          <w:sz w:val="20"/>
+          <w:szCs w:val="20"/>
+          <w:lang w:val="en-US"/>
+        </w:rPr>
+        <w:t xml:space="preserve">. SBS40a </w:t>
+      </w:r>
+      <w:r>
+        <w:rPr>
+          <w:rFonts w:ascii="Times New Roman" w:hAnsi="Times New Roman" w:cs="Times New Roman"/>
+          <w:sz w:val="20"/>
+          <w:szCs w:val="20"/>
+          <w:lang w:val="en-US"/>
+        </w:rPr>
+        <w:t xml:space="preserve">has no reported </w:t>
+      </w:r>
+      <w:proofErr w:type="spellStart"/>
+      <w:proofErr w:type="gramStart"/>
+      <w:r>
+        <w:rPr>
+          <w:rFonts w:ascii="Times New Roman" w:hAnsi="Times New Roman" w:cs="Times New Roman"/>
+          <w:sz w:val="20"/>
+          <w:szCs w:val="20"/>
+          <w:lang w:val="en-US"/>
+        </w:rPr>
+        <w:t>aetiology</w:t>
+      </w:r>
+      <w:proofErr w:type="spellEnd"/>
+      <w:proofErr w:type="gramEnd"/>
+      <w:r>
+        <w:rPr>
+          <w:rFonts w:ascii="Times New Roman" w:hAnsi="Times New Roman" w:cs="Times New Roman"/>
+          <w:sz w:val="20"/>
+          <w:szCs w:val="20"/>
+          <w:lang w:val="en-US"/>
+        </w:rPr>
+        <w:t xml:space="preserve"> and it has been identified in clear cell renal cell </w:t>
+      </w:r>
+      <w:r>
+        <w:rPr>
+          <w:rFonts w:ascii="Times New Roman" w:hAnsi="Times New Roman" w:cs="Times New Roman"/>
+          <w:sz w:val="20"/>
+          <w:szCs w:val="20"/>
+          <w:lang w:val="en-US"/>
+        </w:rPr>
+        <w:lastRenderedPageBreak/>
+        <w:t>carcinomas and other many types of cancer</w:t>
+      </w:r>
+      <w:r>
+        <w:rPr>
+          <w:rFonts w:ascii="Times New Roman" w:hAnsi="Times New Roman" w:cs="Times New Roman"/>
+          <w:sz w:val="20"/>
+          <w:szCs w:val="20"/>
+          <w:lang w:val="en-US"/>
+        </w:rPr>
+        <w:t>. SBS22a</w:t>
+      </w:r>
+      <w:r>
+        <w:rPr>
+          <w:rFonts w:ascii="Times New Roman" w:hAnsi="Times New Roman" w:cs="Times New Roman"/>
+          <w:sz w:val="20"/>
+          <w:szCs w:val="20"/>
+          <w:lang w:val="en-US"/>
+        </w:rPr>
+        <w:t xml:space="preserve"> has a reported </w:t>
+      </w:r>
+      <w:proofErr w:type="spellStart"/>
+      <w:r>
+        <w:rPr>
+          <w:rFonts w:ascii="Times New Roman" w:hAnsi="Times New Roman" w:cs="Times New Roman"/>
+          <w:sz w:val="20"/>
+          <w:szCs w:val="20"/>
+          <w:lang w:val="en-US"/>
+        </w:rPr>
+        <w:t>aetiology</w:t>
+      </w:r>
+      <w:proofErr w:type="spellEnd"/>
+      <w:r>
+        <w:rPr>
+          <w:rFonts w:ascii="Times New Roman" w:hAnsi="Times New Roman" w:cs="Times New Roman"/>
+          <w:sz w:val="20"/>
+          <w:szCs w:val="20"/>
+          <w:lang w:val="en-US"/>
+        </w:rPr>
+        <w:t xml:space="preserve"> of aristolochic acid exposure, and it has been found in liver cancer</w:t>
+      </w:r>
+      <w:r>
+        <w:rPr>
+          <w:rFonts w:ascii="Times New Roman" w:hAnsi="Times New Roman" w:cs="Times New Roman"/>
+          <w:sz w:val="20"/>
+          <w:szCs w:val="20"/>
+          <w:lang w:val="en-US"/>
+        </w:rPr>
+        <w:t xml:space="preserve">. </w:t>
+      </w:r>
+      <w:r>
+        <w:rPr>
+          <w:rFonts w:ascii="Times New Roman" w:hAnsi="Times New Roman" w:cs="Times New Roman"/>
+          <w:sz w:val="20"/>
+          <w:szCs w:val="20"/>
+          <w:lang w:val="en-US"/>
+        </w:rPr>
+        <w:t xml:space="preserve">SBS95, the fourth most common signature, is reported to be a possible sequencing artifact </w:t>
+      </w:r>
+      <w:r>
+        <w:rPr>
+          <w:rFonts w:ascii="Times New Roman" w:hAnsi="Times New Roman" w:cs="Times New Roman"/>
+          <w:sz w:val="20"/>
+          <w:szCs w:val="20"/>
+          <w:lang w:val="en-US"/>
+        </w:rPr>
+        <w:t xml:space="preserve">and it has been identified on liver hepatocellular carcinoma </w:t>
+      </w:r>
+      <w:r>
+        <w:rPr>
+          <w:rFonts w:ascii="Times New Roman" w:hAnsi="Times New Roman" w:cs="Times New Roman"/>
+          <w:sz w:val="20"/>
+          <w:szCs w:val="20"/>
+          <w:lang w:val="en-US"/>
+        </w:rPr>
+        <w:t xml:space="preserve">(LIHC) </w:t>
+      </w:r>
+      <w:r>
+        <w:rPr>
+          <w:rFonts w:ascii="Times New Roman" w:hAnsi="Times New Roman" w:cs="Times New Roman"/>
+          <w:sz w:val="20"/>
+          <w:szCs w:val="20"/>
+          <w:lang w:val="en-US"/>
+        </w:rPr>
+        <w:t>samples</w:t>
+      </w:r>
+      <w:r>
+        <w:rPr>
+          <w:rFonts w:ascii="Times New Roman" w:hAnsi="Times New Roman" w:cs="Times New Roman"/>
+          <w:sz w:val="20"/>
+          <w:szCs w:val="20"/>
+          <w:lang w:val="en-US"/>
+        </w:rPr>
+        <w:t xml:space="preserve">. </w:t>
+      </w:r>
+      <w:r>
+        <w:rPr>
+          <w:rFonts w:ascii="Times New Roman" w:hAnsi="Times New Roman" w:cs="Times New Roman"/>
+          <w:sz w:val="20"/>
+          <w:szCs w:val="20"/>
+          <w:lang w:val="en-US"/>
+        </w:rPr>
+        <w:t xml:space="preserve">SBS12 </w:t>
+      </w:r>
+      <w:r>
+        <w:rPr>
+          <w:rFonts w:ascii="Times New Roman" w:hAnsi="Times New Roman" w:cs="Times New Roman"/>
+          <w:sz w:val="20"/>
+          <w:szCs w:val="20"/>
+          <w:lang w:val="en-US"/>
+        </w:rPr>
+        <w:t xml:space="preserve">has no reported </w:t>
+      </w:r>
+      <w:proofErr w:type="spellStart"/>
+      <w:proofErr w:type="gramStart"/>
+      <w:r>
+        <w:rPr>
+          <w:rFonts w:ascii="Times New Roman" w:hAnsi="Times New Roman" w:cs="Times New Roman"/>
+          <w:sz w:val="20"/>
+          <w:szCs w:val="20"/>
+          <w:lang w:val="en-US"/>
+        </w:rPr>
+        <w:t>aetiology</w:t>
+      </w:r>
+      <w:proofErr w:type="spellEnd"/>
+      <w:r>
+        <w:rPr>
+          <w:rFonts w:ascii="Times New Roman" w:hAnsi="Times New Roman" w:cs="Times New Roman"/>
+          <w:sz w:val="20"/>
+          <w:szCs w:val="20"/>
+          <w:lang w:val="en-US"/>
+        </w:rPr>
+        <w:t>, but</w:t>
+      </w:r>
+      <w:proofErr w:type="gramEnd"/>
+      <w:r>
+        <w:rPr>
+          <w:rFonts w:ascii="Times New Roman" w:hAnsi="Times New Roman" w:cs="Times New Roman"/>
+          <w:sz w:val="20"/>
+          <w:szCs w:val="20"/>
+          <w:lang w:val="en-US"/>
+        </w:rPr>
+        <w:t xml:space="preserve"> usually contributes to a small percentage (&lt;20%) of mutations in liver cancer samples.</w:t>
+      </w:r>
+      <w:r>
+        <w:rPr>
+          <w:rFonts w:ascii="Times New Roman" w:hAnsi="Times New Roman" w:cs="Times New Roman"/>
+          <w:sz w:val="20"/>
+          <w:szCs w:val="20"/>
+          <w:lang w:val="en-US"/>
+        </w:rPr>
+        <w:t xml:space="preserve"> SBS16 </w:t>
+      </w:r>
+      <w:r>
+        <w:rPr>
+          <w:rFonts w:ascii="Times New Roman" w:hAnsi="Times New Roman" w:cs="Times New Roman"/>
+          <w:sz w:val="20"/>
+          <w:szCs w:val="20"/>
+          <w:lang w:val="en-US"/>
+        </w:rPr>
+        <w:t>has been reported contribution by elevated levels of DNA damage on untranscribed strands and LIHC is the third cancer with a higher distribution of this signature</w:t>
+      </w:r>
+      <w:r>
+        <w:rPr>
+          <w:rFonts w:ascii="Times New Roman" w:hAnsi="Times New Roman" w:cs="Times New Roman"/>
+          <w:sz w:val="20"/>
+          <w:szCs w:val="20"/>
+          <w:lang w:val="en-US"/>
+        </w:rPr>
+        <w:t xml:space="preserve">. SBS1 </w:t>
+      </w:r>
+      <w:r>
+        <w:rPr>
+          <w:rFonts w:ascii="Times New Roman" w:hAnsi="Times New Roman" w:cs="Times New Roman"/>
+          <w:sz w:val="20"/>
+          <w:szCs w:val="20"/>
+          <w:lang w:val="en-US"/>
+        </w:rPr>
+        <w:t xml:space="preserve">has a reported </w:t>
+      </w:r>
+      <w:proofErr w:type="spellStart"/>
+      <w:r>
+        <w:rPr>
+          <w:rFonts w:ascii="Times New Roman" w:hAnsi="Times New Roman" w:cs="Times New Roman"/>
+          <w:sz w:val="20"/>
+          <w:szCs w:val="20"/>
+          <w:lang w:val="en-US"/>
+        </w:rPr>
+        <w:t>aetiology</w:t>
+      </w:r>
+      <w:proofErr w:type="spellEnd"/>
+      <w:r>
+        <w:rPr>
+          <w:rFonts w:ascii="Times New Roman" w:hAnsi="Times New Roman" w:cs="Times New Roman"/>
+          <w:sz w:val="20"/>
+          <w:szCs w:val="20"/>
+          <w:lang w:val="en-US"/>
+        </w:rPr>
+        <w:t xml:space="preserve"> of a spontaneous deamination of 5-methylcytosine to thymine that fails to be detected and the substitution fixates,</w:t>
+      </w:r>
+      <w:r>
+        <w:rPr>
+          <w:rFonts w:ascii="Times New Roman" w:hAnsi="Times New Roman" w:cs="Times New Roman"/>
+          <w:sz w:val="20"/>
+          <w:szCs w:val="20"/>
+          <w:lang w:val="en-US"/>
+        </w:rPr>
+        <w:t xml:space="preserve"> but</w:t>
+      </w:r>
+      <w:r>
+        <w:rPr>
+          <w:rFonts w:ascii="Times New Roman" w:hAnsi="Times New Roman" w:cs="Times New Roman"/>
+          <w:sz w:val="20"/>
+          <w:szCs w:val="20"/>
+          <w:lang w:val="en-US"/>
+        </w:rPr>
+        <w:t xml:space="preserve"> LIHC has a low median mutations per Megabase</w:t>
+      </w:r>
+      <w:r>
+        <w:rPr>
+          <w:rFonts w:ascii="Times New Roman" w:hAnsi="Times New Roman" w:cs="Times New Roman"/>
+          <w:sz w:val="20"/>
+          <w:szCs w:val="20"/>
+          <w:lang w:val="en-US"/>
+        </w:rPr>
+        <w:t xml:space="preserve">. SBS15 </w:t>
+      </w:r>
+      <w:r>
+        <w:rPr>
+          <w:rFonts w:ascii="Times New Roman" w:hAnsi="Times New Roman" w:cs="Times New Roman"/>
+          <w:sz w:val="20"/>
+          <w:szCs w:val="20"/>
+          <w:lang w:val="en-US"/>
+        </w:rPr>
+        <w:t xml:space="preserve">is reported to have an </w:t>
+      </w:r>
+      <w:proofErr w:type="spellStart"/>
+      <w:r>
+        <w:rPr>
+          <w:rFonts w:ascii="Times New Roman" w:hAnsi="Times New Roman" w:cs="Times New Roman"/>
+          <w:sz w:val="20"/>
+          <w:szCs w:val="20"/>
+          <w:lang w:val="en-US"/>
+        </w:rPr>
+        <w:t>aetiology</w:t>
+      </w:r>
+      <w:proofErr w:type="spellEnd"/>
+      <w:r>
+        <w:rPr>
+          <w:rFonts w:ascii="Times New Roman" w:hAnsi="Times New Roman" w:cs="Times New Roman"/>
+          <w:sz w:val="20"/>
+          <w:szCs w:val="20"/>
+          <w:lang w:val="en-US"/>
+        </w:rPr>
+        <w:t xml:space="preserve"> involved in defective DNA mismatch repair and it is not found in IHC samples</w:t>
+      </w:r>
+      <w:r>
+        <w:rPr>
+          <w:rFonts w:ascii="Times New Roman" w:hAnsi="Times New Roman" w:cs="Times New Roman"/>
+          <w:sz w:val="20"/>
+          <w:szCs w:val="20"/>
+          <w:lang w:val="en-US"/>
+        </w:rPr>
+        <w:t xml:space="preserve">. SBS21 </w:t>
+      </w:r>
+      <w:r>
+        <w:rPr>
+          <w:rFonts w:ascii="Times New Roman" w:hAnsi="Times New Roman" w:cs="Times New Roman"/>
+          <w:sz w:val="20"/>
+          <w:szCs w:val="20"/>
+          <w:lang w:val="en-US"/>
+        </w:rPr>
+        <w:t xml:space="preserve">is reported to have an </w:t>
+      </w:r>
+      <w:proofErr w:type="spellStart"/>
+      <w:r>
+        <w:rPr>
+          <w:rFonts w:ascii="Times New Roman" w:hAnsi="Times New Roman" w:cs="Times New Roman"/>
+          <w:sz w:val="20"/>
+          <w:szCs w:val="20"/>
+          <w:lang w:val="en-US"/>
+        </w:rPr>
+        <w:t>aetiology</w:t>
+      </w:r>
+      <w:proofErr w:type="spellEnd"/>
+      <w:r>
+        <w:rPr>
+          <w:rFonts w:ascii="Times New Roman" w:hAnsi="Times New Roman" w:cs="Times New Roman"/>
+          <w:sz w:val="20"/>
+          <w:szCs w:val="20"/>
+          <w:lang w:val="en-US"/>
+        </w:rPr>
+        <w:t xml:space="preserve"> involved in DNA mismatch repair deficiency and is not found in LIHC samples</w:t>
+      </w:r>
+      <w:r>
+        <w:rPr>
+          <w:rFonts w:ascii="Times New Roman" w:hAnsi="Times New Roman" w:cs="Times New Roman"/>
+          <w:sz w:val="20"/>
+          <w:szCs w:val="20"/>
+          <w:lang w:val="en-US"/>
+        </w:rPr>
+        <w:t xml:space="preserve">. </w:t>
+      </w:r>
+      <w:r>
+        <w:rPr>
+          <w:rFonts w:ascii="Times New Roman" w:hAnsi="Times New Roman" w:cs="Times New Roman"/>
+          <w:sz w:val="20"/>
+          <w:szCs w:val="20"/>
+          <w:lang w:val="en-US"/>
+        </w:rPr>
+        <w:t xml:space="preserve">The quality of the reconstructed mutation profile by </w:t>
+      </w:r>
+      <w:proofErr w:type="spellStart"/>
+      <w:r>
+        <w:rPr>
+          <w:rFonts w:ascii="Times New Roman" w:hAnsi="Times New Roman" w:cs="Times New Roman"/>
+          <w:sz w:val="20"/>
+          <w:szCs w:val="20"/>
+          <w:lang w:val="en-US"/>
+        </w:rPr>
+        <w:t>SigProfilerAssignment</w:t>
+      </w:r>
+      <w:proofErr w:type="spellEnd"/>
+      <w:r>
+        <w:rPr>
+          <w:rFonts w:ascii="Times New Roman" w:hAnsi="Times New Roman" w:cs="Times New Roman"/>
+          <w:sz w:val="20"/>
+          <w:szCs w:val="20"/>
+          <w:lang w:val="en-US"/>
+        </w:rPr>
+        <w:t xml:space="preserve"> was measured by the cosine similarity metric</w:t>
+      </w:r>
+      <w:r>
+        <w:rPr>
+          <w:rFonts w:ascii="Times New Roman" w:hAnsi="Times New Roman" w:cs="Times New Roman"/>
+          <w:sz w:val="20"/>
+          <w:szCs w:val="20"/>
+          <w:lang w:val="en-US"/>
+        </w:rPr>
+        <w:t xml:space="preserve"> (Supplemental </w:t>
+      </w:r>
+      <w:proofErr w:type="spellStart"/>
+      <w:r>
+        <w:rPr>
+          <w:rFonts w:ascii="Times New Roman" w:hAnsi="Times New Roman" w:cs="Times New Roman"/>
+          <w:sz w:val="20"/>
+          <w:szCs w:val="20"/>
+          <w:lang w:val="en-US"/>
+        </w:rPr>
+        <w:t>fig.d</w:t>
+      </w:r>
+      <w:proofErr w:type="spellEnd"/>
+      <w:r>
+        <w:rPr>
+          <w:rFonts w:ascii="Times New Roman" w:hAnsi="Times New Roman" w:cs="Times New Roman"/>
+          <w:sz w:val="20"/>
+          <w:szCs w:val="20"/>
+          <w:lang w:val="en-US"/>
+        </w:rPr>
+        <w:t>)</w:t>
+      </w:r>
+      <w:r>
+        <w:rPr>
+          <w:rFonts w:ascii="Times New Roman" w:hAnsi="Times New Roman" w:cs="Times New Roman"/>
+          <w:sz w:val="20"/>
+          <w:szCs w:val="20"/>
+          <w:lang w:val="en-US"/>
+        </w:rPr>
+        <w:t>, of which historically there has been inconsistency in the assignment of a threshold for a good quality reconstruction, albeit the selection of a threshold score between 0.75 and 0.8 is commonly reported for reconstructions based on reported mutational signatures and a score of 0.75 or less is commonly selected for de novo mutational signatures.</w:t>
+      </w:r>
+      <w:r>
+        <w:rPr>
+          <w:rFonts w:ascii="Times New Roman" w:hAnsi="Times New Roman" w:cs="Times New Roman"/>
+          <w:sz w:val="20"/>
+          <w:szCs w:val="20"/>
+          <w:lang w:val="en-US"/>
+        </w:rPr>
+        <w:t xml:space="preserve"> </w:t>
+      </w:r>
+      <w:r>
+        <w:rPr>
+          <w:rFonts w:ascii="Times New Roman" w:hAnsi="Times New Roman" w:cs="Times New Roman"/>
+          <w:sz w:val="20"/>
+          <w:szCs w:val="20"/>
+          <w:lang w:val="en-US"/>
+        </w:rPr>
+        <w:t>In our reconstruction the distribution of the cosine similarity of the samples approximates to a normal distribution where the mean is position at a cosine similarity score of 0.85, which stands above the stablished quality standard for this metric.</w:t>
       </w:r>
     </w:p>
     <w:p>
       <w:pPr>
-        <w:rPr>
-          <w:lang w:val="en-US"/>
+        <w:keepNext/>
+        <w:spacing w:line="480" w:lineRule="auto"/>
+        <w:jc w:val="both"/>
+        <w:rPr>
+          <w:rFonts w:ascii="Times New Roman" w:hAnsi="Times New Roman" w:cs="Times New Roman"/>
         </w:rPr>
       </w:pPr>
-    </w:p>
-    <w:p>
-      <w:pPr>
-        <w:rPr>
-          <w:lang w:val="en-US"/>
-        </w:rPr>
-      </w:pPr>
-    </w:p>
-    <w:p>
-      <w:pPr>
-        <w:jc w:val="both"/>
-        <w:rPr>
-          <w:lang w:val="en-US"/>
-        </w:rPr>
-      </w:pPr>
-      <w:r>
-        <w:rPr>
-          <w:lang w:val="en-US"/>
-        </w:rPr>
-        <w:lastRenderedPageBreak/>
-        <w:t xml:space="preserve">The </w:t>
-      </w:r>
-      <w:r>
-        <w:rPr>
-          <w:lang w:val="en-US"/>
-        </w:rPr>
-        <w:t xml:space="preserve">quality of the </w:t>
-      </w:r>
-      <w:r>
-        <w:rPr>
-          <w:lang w:val="en-US"/>
-        </w:rPr>
-        <w:t xml:space="preserve">reconstructed mutation </w:t>
-      </w:r>
-      <w:r>
-        <w:rPr>
-          <w:lang w:val="en-US"/>
-        </w:rPr>
-        <w:t>profile</w:t>
-      </w:r>
-      <w:r>
-        <w:rPr>
-          <w:lang w:val="en-US"/>
-        </w:rPr>
-        <w:t xml:space="preserve"> by </w:t>
-      </w:r>
-      <w:proofErr w:type="spellStart"/>
-      <w:r>
-        <w:rPr>
-          <w:lang w:val="en-US"/>
-        </w:rPr>
-        <w:t>SigProfilerAssignment</w:t>
-      </w:r>
-      <w:proofErr w:type="spellEnd"/>
-      <w:r>
-        <w:rPr>
-          <w:lang w:val="en-US"/>
-        </w:rPr>
-        <w:t xml:space="preserve"> was measured by the cosine similarity metric, </w:t>
-      </w:r>
-      <w:r>
-        <w:rPr>
-          <w:lang w:val="en-US"/>
-        </w:rPr>
-        <w:t>of which</w:t>
-      </w:r>
-      <w:r>
-        <w:rPr>
-          <w:lang w:val="en-US"/>
-        </w:rPr>
-        <w:t xml:space="preserve"> </w:t>
-      </w:r>
-      <w:r>
-        <w:rPr>
-          <w:lang w:val="en-US"/>
-        </w:rPr>
-        <w:t xml:space="preserve">historically there has been </w:t>
-      </w:r>
-      <w:r>
-        <w:rPr>
-          <w:lang w:val="en-US"/>
-        </w:rPr>
-        <w:t>inconsistency in the assignment of a threshold</w:t>
-      </w:r>
-      <w:r>
-        <w:rPr>
-          <w:lang w:val="en-US"/>
-        </w:rPr>
-        <w:t xml:space="preserve"> </w:t>
-      </w:r>
-      <w:r>
-        <w:rPr>
-          <w:lang w:val="en-US"/>
-        </w:rPr>
-        <w:t>for</w:t>
-      </w:r>
-      <w:r>
-        <w:rPr>
-          <w:lang w:val="en-US"/>
-        </w:rPr>
-        <w:t xml:space="preserve"> a good quality reconstruction</w:t>
-      </w:r>
-      <w:r>
-        <w:rPr>
-          <w:lang w:val="en-US"/>
-        </w:rPr>
-        <w:t xml:space="preserve">, albeit the selection of a threshold score between 0.75 and 0.8 is commonly reported for reconstructions based on reported mutational signatures and a score of 0.75 or less is commonly selected for </w:t>
-      </w:r>
-      <w:r>
-        <w:rPr>
-          <w:i/>
-          <w:iCs/>
-          <w:lang w:val="en-US"/>
-        </w:rPr>
-        <w:t xml:space="preserve">de novo </w:t>
-      </w:r>
-      <w:r>
-        <w:rPr>
-          <w:lang w:val="en-US"/>
-        </w:rPr>
-        <w:t>mutational signatures (</w:t>
-      </w:r>
-      <w:hyperlink r:id="rId4" w:history="1">
-        <w:r>
-          <w:rPr>
-            <w:rStyle w:val="Hyperlink"/>
-            <w:lang w:val="en-US"/>
-          </w:rPr>
-          <w:t>https://journals.plos.org/plosone/article?id=10.</w:t>
-        </w:r>
-        <w:r>
-          <w:rPr>
-            <w:rStyle w:val="Hyperlink"/>
-            <w:lang w:val="en-US"/>
-          </w:rPr>
-          <w:t>1</w:t>
-        </w:r>
-        <w:r>
-          <w:rPr>
-            <w:rStyle w:val="Hyperlink"/>
-            <w:lang w:val="en-US"/>
-          </w:rPr>
-          <w:t>371/journal.pone.0221235</w:t>
-        </w:r>
-      </w:hyperlink>
-      <w:r>
-        <w:rPr>
-          <w:lang w:val="en-US"/>
-        </w:rPr>
-        <w:t>)</w:t>
-      </w:r>
-      <w:r>
-        <w:rPr>
-          <w:lang w:val="en-US"/>
-        </w:rPr>
-        <w:t xml:space="preserve">. In our reconstruction the distribution of the cosine similarity of the samples approximates to a normal distribution where the mean is position at a cosine similarity score of 0.85, which stands </w:t>
-      </w:r>
-      <w:r>
-        <w:rPr>
-          <w:lang w:val="en-US"/>
-        </w:rPr>
-        <w:t>above</w:t>
-      </w:r>
-      <w:r>
-        <w:rPr>
-          <w:lang w:val="en-US"/>
-        </w:rPr>
-        <w:t xml:space="preserve"> the stablished quality standard for this metric. </w:t>
-      </w:r>
-    </w:p>
-    <w:p>
-      <w:pPr>
-        <w:rPr>
-          <w:lang w:val="es-ES_tradnl"/>
-        </w:rPr>
-      </w:pPr>
-      <w:r>
-        <w:rPr>
-          <w:noProof/>
-          <w:lang w:val="es-ES_tradnl"/>
+      <w:r>
+        <w:rPr>
+          <w:rFonts w:ascii="Times New Roman" w:hAnsi="Times New Roman" w:cs="Times New Roman"/>
+          <w:lang w:val="en-US"/>
         </w:rPr>
         <w:drawing>
-          <wp:inline distT="0" distB="0" distL="0" distR="0" wp14:anchorId="4A5E16ED" wp14:editId="5BE36AAA">
-            <wp:extent cx="1677725" cy="1677725"/>
+          <wp:inline distT="0" distB="0" distL="0" distR="0" wp14:anchorId="53D467AD" wp14:editId="3AA4CB4F">
+            <wp:extent cx="5943600" cy="1376045"/>
             <wp:effectExtent l="0" t="0" r="0" b="0"/>
-            <wp:docPr id="434203670" name="Picture 1"/>
+            <wp:docPr id="486008415" name="Picture 1"/>
             <wp:cNvGraphicFramePr>
               <a:graphicFrameLocks xmlns:a="http://schemas.openxmlformats.org/drawingml/2006/main" noChangeAspect="1"/>
             </wp:cNvGraphicFramePr>
@@ -451,7 +1633,7 @@
               <a:graphicData uri="http://schemas.openxmlformats.org/drawingml/2006/picture">
                 <pic:pic xmlns:pic="http://schemas.openxmlformats.org/drawingml/2006/picture">
                   <pic:nvPicPr>
-                    <pic:cNvPr id="434203670" name=""/>
+                    <pic:cNvPr id="486008415" name=""/>
                     <pic:cNvPicPr/>
                   </pic:nvPicPr>
                   <pic:blipFill>
@@ -463,7 +1645,7 @@
                   <pic:spPr>
                     <a:xfrm>
                       <a:off x="0" y="0"/>
-                      <a:ext cx="1692470" cy="1692470"/>
+                      <a:ext cx="5943600" cy="1376045"/>
                     </a:xfrm>
                     <a:prstGeom prst="rect">
                       <a:avLst/>
@@ -478,76 +1660,436 @@
     </w:p>
     <w:p>
       <w:pPr>
-        <w:rPr>
-          <w:lang w:val="es-ES_tradnl"/>
+        <w:pStyle w:val="Caption"/>
+        <w:spacing w:line="480" w:lineRule="auto"/>
+        <w:jc w:val="both"/>
+        <w:rPr>
+          <w:rFonts w:ascii="Times New Roman" w:hAnsi="Times New Roman" w:cs="Times New Roman"/>
+          <w:lang w:val="en-US"/>
+        </w:rPr>
+      </w:pPr>
+      <w:r>
+        <w:rPr>
+          <w:rFonts w:ascii="Times New Roman" w:hAnsi="Times New Roman" w:cs="Times New Roman"/>
+        </w:rPr>
+        <w:t xml:space="preserve">Figure </w:t>
+      </w:r>
+      <w:r>
+        <w:rPr>
+          <w:rFonts w:ascii="Times New Roman" w:hAnsi="Times New Roman" w:cs="Times New Roman"/>
+        </w:rPr>
+        <w:t>A</w:t>
+      </w:r>
+      <w:r>
+        <w:rPr>
+          <w:rFonts w:ascii="Times New Roman" w:hAnsi="Times New Roman" w:cs="Times New Roman"/>
+        </w:rPr>
+        <w:t xml:space="preserve"> Average mutational profile plot.</w:t>
+      </w:r>
+    </w:p>
+    <w:p>
+      <w:pPr>
+        <w:keepNext/>
+        <w:spacing w:line="480" w:lineRule="auto"/>
+      </w:pPr>
+      <w:r>
+        <w:rPr>
+          <w:rFonts w:ascii="Times New Roman" w:hAnsi="Times New Roman" w:cs="Times New Roman"/>
+          <w:noProof/>
+          <w:lang w:val="en-US"/>
+        </w:rPr>
+        <w:lastRenderedPageBreak/>
+        <w:drawing>
+          <wp:inline distT="0" distB="0" distL="0" distR="0" wp14:anchorId="55D7031C" wp14:editId="7C9FF966">
+            <wp:extent cx="5943600" cy="3755390"/>
+            <wp:effectExtent l="0" t="0" r="0" b="3810"/>
+            <wp:docPr id="1414759595" name="Picture 1"/>
+            <wp:cNvGraphicFramePr>
+              <a:graphicFrameLocks xmlns:a="http://schemas.openxmlformats.org/drawingml/2006/main" noChangeAspect="1"/>
+            </wp:cNvGraphicFramePr>
+            <a:graphic xmlns:a="http://schemas.openxmlformats.org/drawingml/2006/main">
+              <a:graphicData uri="http://schemas.openxmlformats.org/drawingml/2006/picture">
+                <pic:pic xmlns:pic="http://schemas.openxmlformats.org/drawingml/2006/picture">
+                  <pic:nvPicPr>
+                    <pic:cNvPr id="1414759595" name="Picture 1414759595"/>
+                    <pic:cNvPicPr/>
+                  </pic:nvPicPr>
+                  <pic:blipFill>
+                    <a:blip r:embed="rId6" cstate="print">
+                      <a:extLst>
+                        <a:ext uri="{28A0092B-C50C-407E-A947-70E740481C1C}">
+                          <a14:useLocalDpi xmlns:a14="http://schemas.microsoft.com/office/drawing/2010/main" val="0"/>
+                        </a:ext>
+                      </a:extLst>
+                    </a:blip>
+                    <a:stretch>
+                      <a:fillRect/>
+                    </a:stretch>
+                  </pic:blipFill>
+                  <pic:spPr>
+                    <a:xfrm>
+                      <a:off x="0" y="0"/>
+                      <a:ext cx="5943600" cy="3755390"/>
+                    </a:xfrm>
+                    <a:prstGeom prst="rect">
+                      <a:avLst/>
+                    </a:prstGeom>
+                  </pic:spPr>
+                </pic:pic>
+              </a:graphicData>
+            </a:graphic>
+          </wp:inline>
+        </w:drawing>
+      </w:r>
+    </w:p>
+    <w:p>
+      <w:pPr>
+        <w:pStyle w:val="Caption"/>
+        <w:rPr>
+          <w:rFonts w:ascii="Times New Roman" w:hAnsi="Times New Roman" w:cs="Times New Roman"/>
+          <w:lang w:val="en-US"/>
+        </w:rPr>
+      </w:pPr>
+      <w:r>
+        <w:t>Figure B Contribution of suggested mutational signatures</w:t>
+      </w:r>
+    </w:p>
+    <w:p>
+      <w:pPr>
+        <w:pStyle w:val="Heading3"/>
+        <w:spacing w:line="480" w:lineRule="auto"/>
+        <w:rPr>
+          <w:rFonts w:ascii="Times New Roman" w:hAnsi="Times New Roman" w:cs="Times New Roman"/>
+          <w:lang w:val="en-US"/>
+        </w:rPr>
+      </w:pPr>
+      <w:r>
+        <w:rPr>
+          <w:rFonts w:ascii="Times New Roman" w:hAnsi="Times New Roman" w:cs="Times New Roman"/>
+          <w:lang w:val="en-US"/>
+        </w:rPr>
+        <w:t>Mutational signatures in driver genes</w:t>
+      </w:r>
+    </w:p>
+    <w:p>
+      <w:pPr>
+        <w:spacing w:line="480" w:lineRule="auto"/>
+        <w:jc w:val="both"/>
+        <w:rPr>
+          <w:rFonts w:ascii="Times New Roman" w:hAnsi="Times New Roman" w:cs="Times New Roman"/>
+          <w:sz w:val="20"/>
+          <w:szCs w:val="20"/>
+          <w:lang w:val="en-US"/>
+        </w:rPr>
+      </w:pPr>
+      <w:r>
+        <w:rPr>
+          <w:rFonts w:ascii="Times New Roman" w:hAnsi="Times New Roman" w:cs="Times New Roman"/>
+          <w:sz w:val="20"/>
+          <w:szCs w:val="20"/>
+          <w:lang w:val="en-US"/>
+        </w:rPr>
+        <w:t>The signature activity of the</w:t>
+      </w:r>
+      <w:r>
+        <w:rPr>
+          <w:rFonts w:ascii="Times New Roman" w:hAnsi="Times New Roman" w:cs="Times New Roman"/>
+          <w:sz w:val="20"/>
+          <w:szCs w:val="20"/>
+          <w:lang w:val="en-US"/>
+        </w:rPr>
+        <w:t xml:space="preserve"> three </w:t>
+      </w:r>
+      <w:r>
+        <w:rPr>
+          <w:rFonts w:ascii="Times New Roman" w:hAnsi="Times New Roman" w:cs="Times New Roman"/>
+          <w:sz w:val="20"/>
+          <w:szCs w:val="20"/>
+          <w:lang w:val="en-US"/>
+        </w:rPr>
+        <w:t xml:space="preserve">most active signatures in the </w:t>
+      </w:r>
+      <w:r>
+        <w:rPr>
+          <w:rFonts w:ascii="Times New Roman" w:hAnsi="Times New Roman" w:cs="Times New Roman"/>
+          <w:sz w:val="20"/>
+          <w:szCs w:val="20"/>
+          <w:lang w:val="en-US"/>
+        </w:rPr>
+        <w:t xml:space="preserve">samples with mutations on the </w:t>
+      </w:r>
+      <w:r>
+        <w:rPr>
+          <w:rFonts w:ascii="Times New Roman" w:hAnsi="Times New Roman" w:cs="Times New Roman"/>
+          <w:sz w:val="20"/>
+          <w:szCs w:val="20"/>
+          <w:lang w:val="en-US"/>
+        </w:rPr>
+        <w:t>two oncogenes (CTNNB1 and NFE2L2), two important tumor suppressors (TP53 and AXIN1) and one</w:t>
+      </w:r>
+      <w:r>
+        <w:rPr>
+          <w:rFonts w:ascii="Times New Roman" w:hAnsi="Times New Roman" w:cs="Times New Roman"/>
+          <w:sz w:val="20"/>
+          <w:szCs w:val="20"/>
+          <w:lang w:val="en-US"/>
+        </w:rPr>
+        <w:t xml:space="preserve"> putative gene with oncogenic activity (CRIP3) was assessed by plotting the activity of each signature for every </w:t>
+      </w:r>
+      <w:r>
+        <w:rPr>
+          <w:rFonts w:ascii="Times New Roman" w:hAnsi="Times New Roman" w:cs="Times New Roman"/>
+          <w:sz w:val="20"/>
+          <w:szCs w:val="20"/>
+          <w:lang w:val="en-US"/>
+        </w:rPr>
+        <w:t>sample with a mutation for the gene of selection (Fig C)</w:t>
+      </w:r>
+      <w:r>
+        <w:rPr>
+          <w:rFonts w:ascii="Times New Roman" w:hAnsi="Times New Roman" w:cs="Times New Roman"/>
+          <w:sz w:val="20"/>
+          <w:szCs w:val="20"/>
+          <w:lang w:val="en-US"/>
+        </w:rPr>
+        <w:t>. Both oncogenes present the same sample as the one with the highest signature activity</w:t>
+      </w:r>
+      <w:r>
+        <w:rPr>
+          <w:rFonts w:ascii="Times New Roman" w:hAnsi="Times New Roman" w:cs="Times New Roman"/>
+          <w:sz w:val="20"/>
+          <w:szCs w:val="20"/>
+          <w:lang w:val="en-US"/>
+        </w:rPr>
+        <w:t>, characterized by the major presence of SBS22a, the second most mutated sample with a mutation in CTNNB1 shares a similar pattern with the most mutated sample; a trend can be seen in the presence of SBS5 in all but one of the samples with a mutation on CTNNB1; SBS40a activity is widespread in samples with mutations on CTNNB1 and in contrast, only one sample with mutations on NFE2L2 exhibits SBS40a activity. Samples with mutations on AXIN1 present a signature activity contrasting to the samples with mutations on TP53, as the number of samples is down to three</w:t>
+      </w:r>
+      <w:r>
+        <w:rPr>
+          <w:rFonts w:ascii="Times New Roman" w:hAnsi="Times New Roman" w:cs="Times New Roman"/>
+          <w:sz w:val="20"/>
+          <w:szCs w:val="20"/>
+          <w:lang w:val="en-US"/>
+        </w:rPr>
+        <w:t xml:space="preserve">, </w:t>
+      </w:r>
+      <w:r>
+        <w:rPr>
+          <w:rFonts w:ascii="Times New Roman" w:hAnsi="Times New Roman" w:cs="Times New Roman"/>
+          <w:sz w:val="20"/>
+          <w:szCs w:val="20"/>
+          <w:lang w:val="en-US"/>
+        </w:rPr>
+        <w:t>there is no signature activity of SBS22a</w:t>
+      </w:r>
+      <w:r>
+        <w:rPr>
+          <w:rFonts w:ascii="Times New Roman" w:hAnsi="Times New Roman" w:cs="Times New Roman"/>
+          <w:sz w:val="20"/>
+          <w:szCs w:val="20"/>
+          <w:lang w:val="en-US"/>
+        </w:rPr>
+        <w:t xml:space="preserve"> and they have low activity; conversely samples with mutations on TP53 exhibit higher activity, even comprising two hypermutators (&gt; 500 mutations), </w:t>
+      </w:r>
+      <w:r>
+        <w:rPr>
+          <w:rFonts w:ascii="Times New Roman" w:hAnsi="Times New Roman" w:cs="Times New Roman"/>
+          <w:sz w:val="20"/>
+          <w:szCs w:val="20"/>
+          <w:lang w:val="en-US"/>
+        </w:rPr>
+        <w:t>there is a substantially higher number of samples</w:t>
+      </w:r>
+      <w:r>
+        <w:rPr>
+          <w:rFonts w:ascii="Times New Roman" w:hAnsi="Times New Roman" w:cs="Times New Roman"/>
+          <w:sz w:val="20"/>
+          <w:szCs w:val="20"/>
+          <w:lang w:val="en-US"/>
+        </w:rPr>
+        <w:t xml:space="preserve"> of which the most mutated present SBS22a activity. In the samples with mutations on both tumor </w:t>
+      </w:r>
+      <w:r>
+        <w:rPr>
+          <w:rFonts w:ascii="Times New Roman" w:hAnsi="Times New Roman" w:cs="Times New Roman"/>
+          <w:sz w:val="20"/>
+          <w:szCs w:val="20"/>
+          <w:lang w:val="en-US"/>
+        </w:rPr>
+        <w:lastRenderedPageBreak/>
+        <w:t>suppressors there is a high relative activity of SBS5.</w:t>
+      </w:r>
+      <w:r>
+        <w:rPr>
+          <w:rFonts w:ascii="Times New Roman" w:hAnsi="Times New Roman" w:cs="Times New Roman"/>
+          <w:sz w:val="20"/>
+          <w:szCs w:val="20"/>
+          <w:lang w:val="en-US"/>
+        </w:rPr>
+        <w:t xml:space="preserve"> In comparison, the samples with mutations on the putative gene CRIP3</w:t>
+      </w:r>
+      <w:r>
+        <w:rPr>
+          <w:rFonts w:ascii="Times New Roman" w:hAnsi="Times New Roman" w:cs="Times New Roman"/>
+          <w:sz w:val="20"/>
+          <w:szCs w:val="20"/>
+          <w:lang w:val="en-US"/>
+        </w:rPr>
+        <w:t xml:space="preserve"> exhibit a higher activity of SBS40a than SBS5 and there is no presence of SBS22a. A recurring characteristic among samples with mutations in the </w:t>
+      </w:r>
+      <w:proofErr w:type="gramStart"/>
+      <w:r>
+        <w:rPr>
+          <w:rFonts w:ascii="Times New Roman" w:hAnsi="Times New Roman" w:cs="Times New Roman"/>
+          <w:sz w:val="20"/>
+          <w:szCs w:val="20"/>
+          <w:lang w:val="en-US"/>
+        </w:rPr>
+        <w:t>aforementioned genes</w:t>
+      </w:r>
+      <w:proofErr w:type="gramEnd"/>
+      <w:r>
+        <w:rPr>
+          <w:rFonts w:ascii="Times New Roman" w:hAnsi="Times New Roman" w:cs="Times New Roman"/>
+          <w:sz w:val="20"/>
+          <w:szCs w:val="20"/>
+          <w:lang w:val="en-US"/>
+        </w:rPr>
+        <w:t>, except for NFE2L2, is that there is at least one sample with a substantially higher number of mutations.</w:t>
+      </w:r>
+    </w:p>
+    <w:p>
+      <w:pPr>
+        <w:keepNext/>
+        <w:spacing w:line="480" w:lineRule="auto"/>
+        <w:jc w:val="both"/>
+      </w:pPr>
+      <w:r>
+        <w:rPr>
+          <w:rFonts w:ascii="Times New Roman" w:hAnsi="Times New Roman" w:cs="Times New Roman"/>
+          <w:noProof/>
+          <w:sz w:val="20"/>
+          <w:szCs w:val="20"/>
+          <w:lang w:val="en-US"/>
+        </w:rPr>
+        <w:drawing>
+          <wp:inline distT="0" distB="0" distL="0" distR="0" wp14:anchorId="66BE5BC6" wp14:editId="30586643">
+            <wp:extent cx="5943600" cy="4237355"/>
+            <wp:effectExtent l="0" t="0" r="0" b="4445"/>
+            <wp:docPr id="45963844" name="Picture 2"/>
+            <wp:cNvGraphicFramePr>
+              <a:graphicFrameLocks xmlns:a="http://schemas.openxmlformats.org/drawingml/2006/main" noChangeAspect="1"/>
+            </wp:cNvGraphicFramePr>
+            <a:graphic xmlns:a="http://schemas.openxmlformats.org/drawingml/2006/main">
+              <a:graphicData uri="http://schemas.openxmlformats.org/drawingml/2006/picture">
+                <pic:pic xmlns:pic="http://schemas.openxmlformats.org/drawingml/2006/picture">
+                  <pic:nvPicPr>
+                    <pic:cNvPr id="45963844" name="Picture 45963844"/>
+                    <pic:cNvPicPr/>
+                  </pic:nvPicPr>
+                  <pic:blipFill>
+                    <a:blip r:embed="rId7" cstate="print">
+                      <a:extLst>
+                        <a:ext uri="{28A0092B-C50C-407E-A947-70E740481C1C}">
+                          <a14:useLocalDpi xmlns:a14="http://schemas.microsoft.com/office/drawing/2010/main" val="0"/>
+                        </a:ext>
+                      </a:extLst>
+                    </a:blip>
+                    <a:stretch>
+                      <a:fillRect/>
+                    </a:stretch>
+                  </pic:blipFill>
+                  <pic:spPr>
+                    <a:xfrm>
+                      <a:off x="0" y="0"/>
+                      <a:ext cx="5943600" cy="4237355"/>
+                    </a:xfrm>
+                    <a:prstGeom prst="rect">
+                      <a:avLst/>
+                    </a:prstGeom>
+                  </pic:spPr>
+                </pic:pic>
+              </a:graphicData>
+            </a:graphic>
+          </wp:inline>
+        </w:drawing>
+      </w:r>
+    </w:p>
+    <w:p>
+      <w:pPr>
+        <w:pStyle w:val="Caption"/>
+        <w:jc w:val="both"/>
+        <w:rPr>
+          <w:rFonts w:ascii="Times New Roman" w:hAnsi="Times New Roman" w:cs="Times New Roman"/>
+          <w:sz w:val="20"/>
+          <w:szCs w:val="20"/>
+          <w:lang w:val="en-US"/>
+        </w:rPr>
+      </w:pPr>
+      <w:r>
+        <w:t xml:space="preserve">Figure C Signature activity of </w:t>
+      </w:r>
+      <w:r>
+        <w:rPr>
+          <w:noProof/>
+        </w:rPr>
+        <w:t>driver genes</w:t>
+      </w:r>
+    </w:p>
+    <w:p>
+      <w:pPr>
+        <w:pStyle w:val="Heading1"/>
+        <w:spacing w:line="480" w:lineRule="auto"/>
+        <w:rPr>
+          <w:rFonts w:ascii="Times New Roman" w:hAnsi="Times New Roman" w:cs="Times New Roman"/>
+          <w:lang w:val="en-US"/>
+        </w:rPr>
+      </w:pPr>
+      <w:r>
+        <w:rPr>
+          <w:rFonts w:ascii="Times New Roman" w:hAnsi="Times New Roman" w:cs="Times New Roman"/>
+          <w:lang w:val="en-US"/>
+        </w:rPr>
+        <w:t>Discussion</w:t>
+      </w:r>
+    </w:p>
+    <w:p>
+      <w:pPr>
+        <w:pStyle w:val="Heading2"/>
+        <w:spacing w:line="480" w:lineRule="auto"/>
+        <w:rPr>
+          <w:rFonts w:ascii="Times New Roman" w:hAnsi="Times New Roman" w:cs="Times New Roman"/>
+          <w:lang w:val="en-US"/>
+        </w:rPr>
+      </w:pPr>
+      <w:r>
+        <w:rPr>
+          <w:rFonts w:ascii="Times New Roman" w:hAnsi="Times New Roman" w:cs="Times New Roman"/>
+          <w:lang w:val="en-US"/>
+        </w:rPr>
+        <w:t>Mutational Signatures</w:t>
+      </w:r>
+    </w:p>
+    <w:p>
+      <w:pPr>
+        <w:spacing w:line="480" w:lineRule="auto"/>
+        <w:rPr>
+          <w:rFonts w:ascii="Times New Roman" w:hAnsi="Times New Roman" w:cs="Times New Roman"/>
+          <w:lang w:val="en-US"/>
         </w:rPr>
       </w:pPr>
     </w:p>
     <w:p>
       <w:pPr>
         <w:pStyle w:val="Heading3"/>
-        <w:rPr>
+        <w:spacing w:line="480" w:lineRule="auto"/>
+        <w:rPr>
+          <w:rFonts w:ascii="Times New Roman" w:hAnsi="Times New Roman" w:cs="Times New Roman"/>
           <w:lang w:val="en-US"/>
         </w:rPr>
       </w:pPr>
       <w:r>
         <w:rPr>
-          <w:lang w:val="en-US"/>
-        </w:rPr>
-        <w:t>Mutational signatures in driver genes</w:t>
-      </w:r>
-    </w:p>
-    <w:p>
-      <w:pPr>
-        <w:rPr>
-          <w:lang w:val="en-US"/>
-        </w:rPr>
-      </w:pPr>
-    </w:p>
-    <w:p>
-      <w:pPr>
-        <w:pStyle w:val="Heading1"/>
-        <w:rPr>
-          <w:lang w:val="en-US"/>
-        </w:rPr>
-      </w:pPr>
-      <w:r>
-        <w:rPr>
-          <w:lang w:val="en-US"/>
-        </w:rPr>
-        <w:t>Discussion</w:t>
-      </w:r>
-    </w:p>
-    <w:p>
-      <w:pPr>
-        <w:pStyle w:val="Heading2"/>
-        <w:rPr>
-          <w:lang w:val="en-US"/>
-        </w:rPr>
-      </w:pPr>
-      <w:r>
-        <w:rPr>
-          <w:lang w:val="en-US"/>
-        </w:rPr>
-        <w:t>Mutational Signatures</w:t>
-      </w:r>
-    </w:p>
-    <w:p>
-      <w:pPr>
-        <w:rPr>
-          <w:lang w:val="en-US"/>
-        </w:rPr>
-      </w:pPr>
-    </w:p>
-    <w:p>
-      <w:pPr>
-        <w:pStyle w:val="Heading3"/>
-        <w:rPr>
-          <w:lang w:val="en-US"/>
-        </w:rPr>
-      </w:pPr>
-      <w:r>
-        <w:rPr>
+          <w:rFonts w:ascii="Times New Roman" w:hAnsi="Times New Roman" w:cs="Times New Roman"/>
           <w:lang w:val="en-US"/>
         </w:rPr>
         <w:t>Mutational signatures in driver genes</w:t>
@@ -1511,6 +3053,25 @@
       <w:u w:val="single"/>
     </w:rPr>
   </w:style>
+  <w:style w:type="paragraph" w:styleId="Caption">
+    <w:name w:val="caption"/>
+    <w:basedOn w:val="Normal"/>
+    <w:next w:val="Normal"/>
+    <w:uiPriority w:val="35"/>
+    <w:unhideWhenUsed/>
+    <w:qFormat/>
+    <w:rsid w:val="00B80D45"/>
+    <w:pPr>
+      <w:spacing w:after="200" w:line="240" w:lineRule="auto"/>
+    </w:pPr>
+    <w:rPr>
+      <w:i/>
+      <w:iCs/>
+      <w:color w:val="0E2841" w:themeColor="text2"/>
+      <w:sz w:val="18"/>
+      <w:szCs w:val="18"/>
+    </w:rPr>
+  </w:style>
 </w:styles>
 </file>
 
@@ -1827,4 +3388,40 @@
     </a:ext>
   </a:extLst>
 </a:theme>
+</file>
+
+<file path=word/webextensions/taskpanes.xml><?xml version="1.0" encoding="utf-8"?>
+<wetp:taskpanes xmlns:wetp="http://schemas.microsoft.com/office/webextensions/taskpanes/2010/11">
+  <wetp:taskpane dockstate="right" visibility="0" width="350" row="0">
+    <wetp:webextensionref xmlns:r="http://schemas.openxmlformats.org/officeDocument/2006/relationships" r:id="rId1"/>
+  </wetp:taskpane>
+</wetp:taskpanes>
+</file>
+
+<file path=word/webextensions/webextension1.xml><?xml version="1.0" encoding="utf-8"?>
+<we:webextension xmlns:we="http://schemas.microsoft.com/office/webextensions/webextension/2010/11" id="{19ADB07B-2AB5-DA44-90B3-4B27D5B8D430}">
+  <we:reference id="f78a3046-9e99-4300-aa2b-5814002b01a2" version="1.55.1.0" store="EXCatalog" storeType="EXCatalog"/>
+  <we:alternateReferences>
+    <we:reference id="WA104382081" version="1.55.1.0" store="en-US" storeType="OMEX"/>
+  </we:alternateReferences>
+  <we:properties>
+    <we:property name="MENDELEY_CITATIONS" value="[]"/>
+    <we:property name="MENDELEY_CITATIONS_LOCALE_CODE" value="&quot;en-GB&quot;"/>
+    <we:property name="MENDELEY_CITATIONS_STYLE" value="{&quot;id&quot;:&quot;https://www.zotero.org/styles/nature&quot;,&quot;title&quot;:&quot;Nature&quot;,&quot;format&quot;:&quot;numeric&quot;,&quot;defaultLocale&quot;:&quot;en-GB&quot;,&quot;isLocaleCodeValid&quot;:true}"/>
+  </we:properties>
+  <we:bindings/>
+  <we:snapshot xmlns:r="http://schemas.openxmlformats.org/officeDocument/2006/relationships"/>
+</we:webextension>
+</file>
+
+<file path=customXml/item1.xml><?xml version="1.0" encoding="utf-8"?>
+<b:Sources xmlns:b="http://schemas.openxmlformats.org/officeDocument/2006/bibliography" xmlns="http://schemas.openxmlformats.org/officeDocument/2006/bibliography" SelectedStyle="/APASixthEditionOfficeOnline.xsl" StyleName="APA" Version="6"/>
+</file>
+
+<file path=customXml/itemProps1.xml><?xml version="1.0" encoding="utf-8"?>
+<ds:datastoreItem xmlns:ds="http://schemas.openxmlformats.org/officeDocument/2006/customXml" ds:itemID="{751D5E5C-A552-B049-833C-10CE17B9E45D}">
+  <ds:schemaRefs>
+    <ds:schemaRef ds:uri="http://schemas.openxmlformats.org/officeDocument/2006/bibliography"/>
+  </ds:schemaRefs>
+</ds:datastoreItem>
 </file>
</xml_diff>